<commit_message>
Making last updates to SIOP submission
</commit_message>
<xml_diff>
--- a/AI_JCM_SIOP.docx
+++ b/AI_JCM_SIOP.docx
@@ -44,16 +44,24 @@
     </w:p>
     <w:p>
       <w:pPr>
-        <w:spacing w:after="240" w:line="240" w:lineRule="auto"/>
+        <w:spacing w:after="0" w:line="240" w:lineRule="auto"/>
       </w:pPr>
       <w:r>
-        <w:t>AI-Adopters</w:t>
+        <w:t>Measuring AI-Adopter Types</w:t>
+      </w:r>
+      <w:r>
+        <w:t xml:space="preserve"> </w:t>
       </w:r>
     </w:p>
     <w:p>
       <w:pPr>
         <w:spacing w:after="0" w:line="240" w:lineRule="auto"/>
       </w:pPr>
+    </w:p>
+    <w:p>
+      <w:pPr>
+        <w:spacing w:after="0" w:line="240" w:lineRule="auto"/>
+      </w:pPr>
       <w:r>
         <w:t>ABSTRACT</w:t>
       </w:r>
@@ -79,7 +87,7 @@
         <w:spacing w:after="0" w:line="240" w:lineRule="auto"/>
       </w:pPr>
       <w:r>
-        <w:t>3000</w:t>
+        <w:t>2,991</w:t>
       </w:r>
     </w:p>
     <w:p>
@@ -311,7 +319,7 @@
           <w:rFonts w:cs="Times New Roman"/>
           <w:b/>
         </w:rPr>
-        <w:t>Procedure</w:t>
+        <w:t>Participants</w:t>
       </w:r>
     </w:p>
     <w:p>
@@ -326,40 +334,47 @@
         <w:rPr>
           <w:rFonts w:cs="Times New Roman"/>
         </w:rPr>
-        <w:t xml:space="preserve">After reading a brief description of the online survey purpose and providing consent, students were asked to think of the context where they use AI the most frequently (for example, as a student or as an employee) and to keep that role in mind for the entire survey. Respondents </w:t>
+        <w:t>One hundred twenty-four undergraduate students responded (</w:t>
+      </w:r>
+      <w:r>
+        <w:rPr>
+          <w:rFonts w:cs="Times New Roman"/>
+          <w:i/>
+        </w:rPr>
+        <w:t>M</w:t>
+      </w:r>
+      <w:r>
+        <w:rPr>
+          <w:rFonts w:cs="Times New Roman"/>
+          <w:vertAlign w:val="subscript"/>
+        </w:rPr>
+        <w:t>age</w:t>
+      </w:r>
+      <w:r>
+        <w:rPr>
+          <w:rFonts w:cs="Times New Roman"/>
+        </w:rPr>
+        <w:t xml:space="preserve"> = 21.58, </w:t>
+      </w:r>
+      <w:r>
+        <w:rPr>
+          <w:rFonts w:cs="Times New Roman"/>
+          <w:i/>
+        </w:rPr>
+        <w:t>SD</w:t>
+      </w:r>
+      <w:r>
+        <w:rPr>
+          <w:rFonts w:cs="Times New Roman"/>
+        </w:rPr>
+        <w:t xml:space="preserve"> = 5.61). The students were given the choice of 50 different majors to choose from, with the greatest representation being Psychology at 38.71%, with a second largest group being Construction </w:t>
       </w:r>
       <w:r>
         <w:rPr>
           <w:rFonts w:cs="Times New Roman"/>
         </w:rPr>
         <w:lastRenderedPageBreak/>
-        <w:t>were presented items in fixed ordering (grouped sequentially within item development procedure), followed by a few demographic questions. Responses to all AI-Adopter items were provided along a shared 5-point Likert-type scale ranging from 1 (</w:t>
-      </w:r>
-      <w:r>
-        <w:rPr>
-          <w:rFonts w:cs="Times New Roman"/>
-          <w:i/>
-        </w:rPr>
-        <w:t>Strongly Disagree</w:t>
-      </w:r>
-      <w:r>
-        <w:rPr>
-          <w:rFonts w:cs="Times New Roman"/>
-        </w:rPr>
-        <w:t>) to 5 (</w:t>
-      </w:r>
-      <w:r>
-        <w:rPr>
-          <w:rFonts w:cs="Times New Roman"/>
-          <w:i/>
-        </w:rPr>
-        <w:t>Strongly Agree</w:t>
-      </w:r>
-      <w:r>
-        <w:rPr>
-          <w:rFonts w:cs="Times New Roman"/>
-        </w:rPr>
-        <w:t>). Following the survey, respondents were debriefed and offered course credit for their time.</w:t>
+        <w:t>majors (15.32%). When asked, “Which context did you have in mind as you responded to the statements in this survey?”, 79.03% indicated “school”, 12.9% indicated “work”, and 7.26% stated “other”.</w:t>
       </w:r>
     </w:p>
     <w:p>
@@ -375,7 +390,7 @@
           <w:rFonts w:cs="Times New Roman"/>
           <w:b/>
         </w:rPr>
-        <w:t>Participants</w:t>
+        <w:t>Materials</w:t>
       </w:r>
     </w:p>
     <w:p>
@@ -390,40 +405,119 @@
         <w:rPr>
           <w:rFonts w:cs="Times New Roman"/>
         </w:rPr>
-        <w:t>One hundred twenty-four undergraduate students responded (</w:t>
+        <w:t>Items were generated based on the three themes uncovered by Callari and Puppione (2025) in their qualitative study on the way employees perceive meaningful work in tasks co-generated by Microsoft 365 Copilot. They identified three ideal types, including an Efficiency-Seeking Type (perceives the AI tool as a straightforward task-assistance tool), a Pragmatic Integrator Type (perceives the AI tool as a smarter assistant), and a Collaborative Optimiser Type (perceives the AI tool as an expert-like teammate). Three different methods of item generation were used (and compared) here.</w:t>
+      </w:r>
+    </w:p>
+    <w:p>
+      <w:pPr>
+        <w:spacing w:after="0" w:line="480" w:lineRule="auto"/>
+        <w:ind w:firstLine="720"/>
+        <w:rPr>
+          <w:rFonts w:cs="Times New Roman"/>
+        </w:rPr>
+      </w:pPr>
+      <w:r>
+        <w:rPr>
+          <w:rFonts w:cs="Times New Roman"/>
+          <w:b/>
+        </w:rPr>
+        <w:t>Expert-Generated Items.</w:t>
+      </w:r>
+      <w:r>
+        <w:rPr>
+          <w:rFonts w:cs="Times New Roman"/>
+        </w:rPr>
+        <w:t xml:space="preserve"> Three of the researchers independently generated 6–8 items per dimension. Combined lists of items were discussed by dimension, and the initial list of 57 candidate items was reduced to </w:t>
       </w:r>
       <w:r>
         <w:rPr>
           <w:rFonts w:cs="Times New Roman"/>
           <w:i/>
         </w:rPr>
-        <w:t>M</w:t>
-      </w:r>
-      <w:r>
-        <w:rPr>
-          <w:rFonts w:cs="Times New Roman"/>
-          <w:vertAlign w:val="subscript"/>
-        </w:rPr>
-        <w:t>age</w:t>
-      </w:r>
-      <w:r>
-        <w:rPr>
-          <w:rFonts w:cs="Times New Roman"/>
-        </w:rPr>
-        <w:t xml:space="preserve"> = 21.58, </w:t>
+        <w:t>k</w:t>
+      </w:r>
+      <w:r>
+        <w:rPr>
+          <w:rFonts w:cs="Times New Roman"/>
+        </w:rPr>
+        <w:t xml:space="preserve"> = 18 through consensus evaluation of item clarity and content domain coverage.</w:t>
+      </w:r>
+    </w:p>
+    <w:p>
+      <w:pPr>
+        <w:spacing w:after="0" w:line="480" w:lineRule="auto"/>
+        <w:ind w:firstLine="720"/>
+        <w:rPr>
+          <w:rFonts w:cs="Times New Roman"/>
+        </w:rPr>
+      </w:pPr>
+      <w:r>
+        <w:rPr>
+          <w:rFonts w:cs="Times New Roman"/>
+          <w:b/>
+        </w:rPr>
+        <w:t>ChatGPT-Generated Items.</w:t>
+      </w:r>
+      <w:r>
+        <w:rPr>
+          <w:rFonts w:cs="Times New Roman"/>
+        </w:rPr>
+        <w:t xml:space="preserve"> The following prompt was input into ChatGPT: “I need your help with generating a tentative list of survey items. I am reading the attached paper for the third time. I am interested in the three AI user ideal types and the survey items that could be generated to measure an employee’s propensity toward one type or another.” Eight items were generated per dimension, along with rationale for those item choices (total </w:t>
       </w:r>
       <w:r>
         <w:rPr>
           <w:rFonts w:cs="Times New Roman"/>
           <w:i/>
         </w:rPr>
-        <w:t>SD</w:t>
-      </w:r>
-      <w:r>
-        <w:rPr>
-          <w:rFonts w:cs="Times New Roman"/>
-        </w:rPr>
-        <w:t xml:space="preserve"> = 5.61). The students were given the choice of 50 different majors to choose from, with the greatest representation being Psychology at 38.71%, with a second largest group being Construction majors (15.32%). When asked, “Which context did you have in mind as you responded to the statements in this survey?”, 79.03% indicated “school”, 12.9% indicated “work”, and 7.26% stated “other”.</w:t>
+        <w:t>k</w:t>
+      </w:r>
+      <w:r>
+        <w:rPr>
+          <w:rFonts w:cs="Times New Roman"/>
+        </w:rPr>
+        <w:t xml:space="preserve"> = 24).</w:t>
+      </w:r>
+    </w:p>
+    <w:p>
+      <w:pPr>
+        <w:spacing w:after="0" w:line="480" w:lineRule="auto"/>
+        <w:ind w:firstLine="720"/>
+        <w:rPr>
+          <w:rFonts w:cs="Times New Roman"/>
+        </w:rPr>
+      </w:pPr>
+      <w:r>
+        <w:rPr>
+          <w:rFonts w:cs="Times New Roman"/>
+          <w:b/>
+        </w:rPr>
+        <w:t>AI-GENIE-Generated Items.</w:t>
+      </w:r>
+      <w:r>
+        <w:rPr>
+          <w:rFonts w:cs="Times New Roman"/>
+        </w:rPr>
+        <w:t xml:space="preserve"> AI-GENIE is a tool for automated item development and validation using large language models and network psychometrics (Russell-Lasalandra et al., 2026). The following initial prompt was input, “You are an expert scale developer and </w:t>
+      </w:r>
+      <w:r>
+        <w:rPr>
+          <w:rFonts w:cs="Times New Roman"/>
+        </w:rPr>
+        <w:lastRenderedPageBreak/>
+        <w:t xml:space="preserve">methodologist who writes high quality and succinct (although with a use a 7th grade reading level) items based on the overarching definition of AI Adopter Type as articulated in Callari and Puppione (2025): ‘Three Ideal Types were identified: Ideal Type (1) – the Efficiency-Seeking Type – perceives AI as a straightforward task-assistance tool, Ideal Type (2) – the Pragmatic Integrator Type – views AI as a smarter assistant, and Ideal Type (3) – the Collaborative Optimiser Type – considers AI an expert-like teammate.’” Definitions of all three of the above dimensions, as well as example descriptors were provided as part of the prompt. Thirty items were initially generated. Combined lists of items were discussed by the researchers by dimension, and the most unique and clearly-written items were retained for the survey (total </w:t>
+      </w:r>
+      <w:r>
+        <w:rPr>
+          <w:rFonts w:cs="Times New Roman"/>
+          <w:i/>
+        </w:rPr>
+        <w:t>k</w:t>
+      </w:r>
+      <w:r>
+        <w:rPr>
+          <w:rFonts w:cs="Times New Roman"/>
+        </w:rPr>
+        <w:t xml:space="preserve"> = 21). All study items, prompts, and materials are available on a publicly accessible repository [hidden for blind review].</w:t>
       </w:r>
     </w:p>
     <w:p>
@@ -439,7 +533,7 @@
           <w:rFonts w:cs="Times New Roman"/>
           <w:b/>
         </w:rPr>
-        <w:t>Materials</w:t>
+        <w:t>Procedure</w:t>
       </w:r>
     </w:p>
     <w:p>
@@ -454,7 +548,66 @@
         <w:rPr>
           <w:rFonts w:cs="Times New Roman"/>
         </w:rPr>
-        <w:t>Items were generated based on the three themes uncovered by Callari and Puppione (2025) in their qualitative study on the way employees perceive meaningful work in tasks co-generated by Microsoft 365 Copilot. They identified three ideal types, including an Efficiency-Seeking Type (perceives the AI tool as a straightforward task-assistance tool), a Pragmatic Integrator Type (perceives the AI tool as a smarter assistant), and a Collaborative Optimiser Type (perceives the AI tool as an expert-like teammate). Three different methods of item generation were used (and compared) here.</w:t>
+        <w:t>After reading a brief description of the online survey purpose and providing consent, students were asked to think of the context where they use AI the most frequently (for example, as a student or as an employee) and to keep that role in mind for the entire survey. Respondents were presented items in fixed ordering (grouped sequentially within item development procedure), followed by a few demographic questions. Responses to all AI-Adopter items were provided along a shared 5-point Likert-type scale ranging from 1 (</w:t>
+      </w:r>
+      <w:r>
+        <w:rPr>
+          <w:rFonts w:cs="Times New Roman"/>
+          <w:i/>
+        </w:rPr>
+        <w:t>Strongly Disagree</w:t>
+      </w:r>
+      <w:r>
+        <w:rPr>
+          <w:rFonts w:cs="Times New Roman"/>
+        </w:rPr>
+        <w:t>) to 5 (</w:t>
+      </w:r>
+      <w:r>
+        <w:rPr>
+          <w:rFonts w:cs="Times New Roman"/>
+          <w:i/>
+        </w:rPr>
+        <w:t>Strongly Agree</w:t>
+      </w:r>
+      <w:r>
+        <w:rPr>
+          <w:rFonts w:cs="Times New Roman"/>
+        </w:rPr>
+        <w:t>). Following the survey, respondents were debriefed and offered course credit for their time.</w:t>
+      </w:r>
+    </w:p>
+    <w:p>
+      <w:pPr>
+        <w:spacing w:after="0" w:line="480" w:lineRule="auto"/>
+        <w:jc w:val="center"/>
+        <w:rPr>
+          <w:rFonts w:cs="Times New Roman"/>
+        </w:rPr>
+      </w:pPr>
+      <w:r>
+        <w:rPr>
+          <w:rFonts w:cs="Times New Roman"/>
+          <w:b/>
+        </w:rPr>
+        <w:t>Results</w:t>
+      </w:r>
+    </w:p>
+    <w:p>
+      <w:pPr>
+        <w:keepNext/>
+        <w:spacing w:after="0" w:line="480" w:lineRule="auto"/>
+        <w:rPr>
+          <w:rFonts w:cs="Times New Roman"/>
+        </w:rPr>
+      </w:pPr>
+      <w:r>
+        <w:rPr>
+          <w:rFonts w:cs="Times New Roman"/>
+          <w:b/>
+        </w:rPr>
+        <w:lastRenderedPageBreak/>
+        <w:t>Traditional Analyses</w:t>
       </w:r>
     </w:p>
     <w:p>
@@ -468,35 +621,166 @@
       <w:r>
         <w:rPr>
           <w:rFonts w:cs="Times New Roman"/>
-          <w:b/>
-        </w:rPr>
-        <w:t>Expert-Generated Items.</w:t>
-      </w:r>
-      <w:r>
-        <w:rPr>
-          <w:rFonts w:cs="Times New Roman"/>
-        </w:rPr>
-        <w:t xml:space="preserve"> Three of the researchers independently generated 6–8 items per dimension. Combined lists of items were discussed by dimension, and the initial list of 57 </w:t>
-      </w:r>
-      <w:r>
-        <w:rPr>
-          <w:rFonts w:cs="Times New Roman"/>
-        </w:rPr>
-        <w:lastRenderedPageBreak/>
-        <w:t xml:space="preserve">candidate items was reduced to </w:t>
+        </w:rPr>
+        <w:t xml:space="preserve">Inter-scale correlations as well as scale means and standard deviations are presented in Table 1. Here, the Efficiency Seeking scales exhibit the least intra-dimension agreement (correlations across item-generation methodologies ranging from </w:t>
       </w:r>
       <w:r>
         <w:rPr>
           <w:rFonts w:cs="Times New Roman"/>
           <w:i/>
         </w:rPr>
-        <w:t>k</w:t>
-      </w:r>
-      <w:r>
-        <w:rPr>
-          <w:rFonts w:cs="Times New Roman"/>
-        </w:rPr>
-        <w:t xml:space="preserve"> = 18 through consensus evaluation of item clarity and content domain coverage.</w:t>
+        <w:t>r</w:t>
+      </w:r>
+      <w:r>
+        <w:rPr>
+          <w:rFonts w:cs="Times New Roman"/>
+          <w:vertAlign w:val="subscript"/>
+        </w:rPr>
+        <w:t>GPT–SME</w:t>
+      </w:r>
+      <w:r>
+        <w:rPr>
+          <w:rFonts w:cs="Times New Roman"/>
+        </w:rPr>
+        <w:t xml:space="preserve"> = .14, </w:t>
+      </w:r>
+      <w:r>
+        <w:rPr>
+          <w:rFonts w:cs="Times New Roman"/>
+          <w:i/>
+        </w:rPr>
+        <w:t>ns</w:t>
+      </w:r>
+      <w:r>
+        <w:rPr>
+          <w:rFonts w:cs="Times New Roman"/>
+        </w:rPr>
+        <w:t xml:space="preserve"> to </w:t>
+      </w:r>
+      <w:r>
+        <w:rPr>
+          <w:rFonts w:cs="Times New Roman"/>
+          <w:i/>
+        </w:rPr>
+        <w:t>r</w:t>
+      </w:r>
+      <w:r>
+        <w:rPr>
+          <w:rFonts w:cs="Times New Roman"/>
+          <w:vertAlign w:val="subscript"/>
+        </w:rPr>
+        <w:t>GPT–Genie</w:t>
+      </w:r>
+      <w:r>
+        <w:rPr>
+          <w:rFonts w:cs="Times New Roman"/>
+        </w:rPr>
+        <w:t xml:space="preserve"> = .51, </w:t>
+      </w:r>
+      <w:r>
+        <w:rPr>
+          <w:rFonts w:cs="Times New Roman"/>
+          <w:i/>
+        </w:rPr>
+        <w:t>p</w:t>
+      </w:r>
+      <w:r>
+        <w:rPr>
+          <w:rFonts w:cs="Times New Roman"/>
+        </w:rPr>
+        <w:t xml:space="preserve"> &lt; .001). Pragmatic Integrator and Collaborative Optimiser scales exhibited consistently higher intra-dimension associations (ranging from a low of </w:t>
+      </w:r>
+      <w:r>
+        <w:rPr>
+          <w:rFonts w:cs="Times New Roman"/>
+          <w:i/>
+        </w:rPr>
+        <w:t>r</w:t>
+      </w:r>
+      <w:r>
+        <w:rPr>
+          <w:rFonts w:cs="Times New Roman"/>
+          <w:vertAlign w:val="subscript"/>
+        </w:rPr>
+        <w:t>Genie(CO)–SME(CO)</w:t>
+      </w:r>
+      <w:r>
+        <w:rPr>
+          <w:rFonts w:cs="Times New Roman"/>
+        </w:rPr>
+        <w:t xml:space="preserve"> = .76, </w:t>
+      </w:r>
+      <w:r>
+        <w:rPr>
+          <w:rFonts w:cs="Times New Roman"/>
+          <w:i/>
+        </w:rPr>
+        <w:t>p</w:t>
+      </w:r>
+      <w:r>
+        <w:rPr>
+          <w:rFonts w:cs="Times New Roman"/>
+        </w:rPr>
+        <w:t xml:space="preserve"> &lt; .001 to a high of </w:t>
+      </w:r>
+      <w:r>
+        <w:rPr>
+          <w:rFonts w:cs="Times New Roman"/>
+          <w:i/>
+        </w:rPr>
+        <w:t>r</w:t>
+      </w:r>
+      <w:r>
+        <w:rPr>
+          <w:rFonts w:cs="Times New Roman"/>
+          <w:vertAlign w:val="subscript"/>
+        </w:rPr>
+        <w:t>Genie(PI)–SME(PI)</w:t>
+      </w:r>
+      <w:r>
+        <w:rPr>
+          <w:rFonts w:cs="Times New Roman"/>
+        </w:rPr>
+        <w:t xml:space="preserve"> = .84, </w:t>
+      </w:r>
+      <w:r>
+        <w:rPr>
+          <w:rFonts w:cs="Times New Roman"/>
+          <w:i/>
+        </w:rPr>
+        <w:t>p</w:t>
+      </w:r>
+      <w:r>
+        <w:rPr>
+          <w:rFonts w:cs="Times New Roman"/>
+        </w:rPr>
+        <w:t xml:space="preserve"> &lt; .001). </w:t>
+      </w:r>
+      <w:r>
+        <w:rPr>
+          <w:rFonts w:cs="Times New Roman"/>
+          <w:i/>
+        </w:rPr>
+        <w:t>Lack</w:t>
+      </w:r>
+      <w:r>
+        <w:rPr>
+          <w:rFonts w:cs="Times New Roman"/>
+        </w:rPr>
+        <w:t xml:space="preserve"> of association with “other” scale dimensions was most prominent with the Efficiency Seeking scales, particularly so for the ChatGPT developed scale (and to a lesser degree, the SME-derived scale; e.g., the average magnitude of correlation was </w:t>
+      </w:r>
+      <w:r>
+        <w:rPr>
+          <w:rFonts w:cs="Times New Roman"/>
+          <w:i/>
+        </w:rPr>
+        <w:t>smallest</w:t>
+      </w:r>
+      <w:r>
+        <w:rPr>
+          <w:rFonts w:cs="Times New Roman"/>
+        </w:rPr>
+        <w:t>).</w:t>
       </w:r>
     </w:p>
     <w:p>
@@ -510,15 +794,8 @@
       <w:r>
         <w:rPr>
           <w:rFonts w:cs="Times New Roman"/>
-          <w:b/>
-        </w:rPr>
-        <w:t>ChatGPT-Generated Items.</w:t>
-      </w:r>
-      <w:r>
-        <w:rPr>
-          <w:rFonts w:cs="Times New Roman"/>
-        </w:rPr>
-        <w:t xml:space="preserve"> The following prompt was input into ChatGPT: “I need your help with generating a tentative list of survey items. I am reading the attached paper for the third time. I am interested in the three AI user ideal types and the survey items that could be generated to measure an employee’s propensity toward one type or another.” Eight items were generated per dimension, along with rationale for those item choices (total </w:t>
+        </w:rPr>
+        <w:t>Individual scale alphas were predominantly within the .8 to .9 range, although two scales exhibited suppressed values (the ChatGPT Efficiency Seeking scale α = .69 and the SME Efficiency Seeking scale α = .59). Note that: 1) these are the two scales that also exhibited the lowest average inter-scale associations (see Table 1), and 2) the numbers of items differed across scales (</w:t>
       </w:r>
       <w:r>
         <w:rPr>
@@ -530,8 +807,55 @@
       <w:r>
         <w:rPr>
           <w:rFonts w:cs="Times New Roman"/>
-        </w:rPr>
-        <w:t xml:space="preserve"> = 24).</w:t>
+          <w:vertAlign w:val="subscript"/>
+        </w:rPr>
+        <w:t>ChatGPT</w:t>
+      </w:r>
+      <w:r>
+        <w:rPr>
+          <w:rFonts w:cs="Times New Roman"/>
+        </w:rPr>
+        <w:t xml:space="preserve"> = 6, </w:t>
+      </w:r>
+      <w:r>
+        <w:rPr>
+          <w:rFonts w:cs="Times New Roman"/>
+          <w:i/>
+        </w:rPr>
+        <w:t>k</w:t>
+      </w:r>
+      <w:r>
+        <w:rPr>
+          <w:rFonts w:cs="Times New Roman"/>
+          <w:vertAlign w:val="subscript"/>
+        </w:rPr>
+        <w:t>SME</w:t>
+      </w:r>
+      <w:r>
+        <w:rPr>
+          <w:rFonts w:cs="Times New Roman"/>
+        </w:rPr>
+        <w:t xml:space="preserve"> = 7, and </w:t>
+      </w:r>
+      <w:r>
+        <w:rPr>
+          <w:rFonts w:cs="Times New Roman"/>
+          <w:i/>
+        </w:rPr>
+        <w:t>k</w:t>
+      </w:r>
+      <w:r>
+        <w:rPr>
+          <w:rFonts w:cs="Times New Roman"/>
+          <w:vertAlign w:val="subscript"/>
+        </w:rPr>
+        <w:t>AI-GENIE</w:t>
+      </w:r>
+      <w:r>
+        <w:rPr>
+          <w:rFonts w:cs="Times New Roman"/>
+        </w:rPr>
+        <w:t xml:space="preserve"> = 8). All scale αs are presented in Table 2.</w:t>
       </w:r>
     </w:p>
     <w:p>
@@ -545,574 +869,257 @@
       <w:r>
         <w:rPr>
           <w:rFonts w:cs="Times New Roman"/>
-          <w:b/>
-        </w:rPr>
-        <w:t>AI-GENIE-Generated Items.</w:t>
-      </w:r>
-      <w:r>
-        <w:rPr>
-          <w:rFonts w:cs="Times New Roman"/>
-        </w:rPr>
-        <w:t xml:space="preserve"> AI-GENIE is a tool for automated item development and validation using large language models and network psychometrics (Russell-Lasalandra et al., 2026). The following initial prompt was input, “You are an expert scale developer and methodologist who writes high quality and succinct (although with a use a 7th grade reading level) items based on the overarching definition of AI Adopter Type as articulated in Callari and Puppione (2025): ‘Three Ideal Types were identified: Ideal Type (1) – the Efficiency-Seeking Type – perceives AI as a straightforward task-assistance tool, Ideal Type (2) – the Pragmatic Integrator Type – views AI as a smarter assistant, and Ideal Type (3) – the Collaborative Optimiser Type – considers AI an expert-like teammate.’” Definitions of all three of the above dimensions, as well as example descriptors were provided as part of the prompt. Thirty items were initially generated. Combined lists of items were discussed by the researchers by dimension, and the most unique and clearly-written items were retained for the survey (total </w:t>
+        </w:rPr>
+        <w:t>Exploratory factor analyses (EFAs) were also conducted within item sets. One-, two-, and three-factor solutions were estimated for each item set using maximum likelihood estimation and an oblique Quartimin rotation. Following Hu and Bentler’s (1999) guidelines, model fit was evaluated using multiple indicators. The results presented here focus only on the three-factor models.</w:t>
+      </w:r>
+    </w:p>
+    <w:p>
+      <w:pPr>
+        <w:spacing w:after="0" w:line="480" w:lineRule="auto"/>
+        <w:ind w:firstLine="720"/>
+        <w:rPr>
+          <w:rFonts w:cs="Times New Roman"/>
+        </w:rPr>
+      </w:pPr>
+      <w:r>
+        <w:rPr>
+          <w:rFonts w:cs="Times New Roman"/>
+        </w:rPr>
+        <w:t xml:space="preserve">The three-factor model for the ChatGPT-generated items returned the weakest structural evidence (χ²(207) = 347.09, </w:t>
       </w:r>
       <w:r>
         <w:rPr>
           <w:rFonts w:cs="Times New Roman"/>
           <w:i/>
         </w:rPr>
-        <w:t>k</w:t>
-      </w:r>
-      <w:r>
-        <w:rPr>
-          <w:rFonts w:cs="Times New Roman"/>
-        </w:rPr>
-        <w:t xml:space="preserve"> = 21). All study items, prompts, and materials are available on a publicly accessible repository [hidden for blind review].</w:t>
+        <w:t>p</w:t>
+      </w:r>
+      <w:r>
+        <w:rPr>
+          <w:rFonts w:cs="Times New Roman"/>
+        </w:rPr>
+        <w:t xml:space="preserve"> &lt; .001, RMSEA = .084, 90% CI [.068, .099], CFI = .879, TLI = .838, and SRMR = .053). Factors 1 and 2 were significantly correlated (</w:t>
+      </w:r>
+      <w:r>
+        <w:rPr>
+          <w:rFonts w:cs="Times New Roman"/>
+          <w:i/>
+        </w:rPr>
+        <w:t>r</w:t>
+      </w:r>
+      <w:r>
+        <w:rPr>
+          <w:rFonts w:cs="Times New Roman"/>
+        </w:rPr>
+        <w:t xml:space="preserve"> = .48, </w:t>
+      </w:r>
+      <w:r>
+        <w:rPr>
+          <w:rFonts w:cs="Times New Roman"/>
+          <w:i/>
+        </w:rPr>
+        <w:t>p</w:t>
+      </w:r>
+      <w:r>
+        <w:rPr>
+          <w:rFonts w:cs="Times New Roman"/>
+        </w:rPr>
+        <w:t xml:space="preserve"> &lt; .05), while </w:t>
+      </w:r>
+      <w:r>
+        <w:rPr>
+          <w:rFonts w:cs="Times New Roman"/>
+        </w:rPr>
+        <w:lastRenderedPageBreak/>
+        <w:t>Factor 3 did not have a significant correlation with Factor 1 (</w:t>
+      </w:r>
+      <w:r>
+        <w:rPr>
+          <w:rFonts w:cs="Times New Roman"/>
+          <w:i/>
+        </w:rPr>
+        <w:t>r</w:t>
+      </w:r>
+      <w:r>
+        <w:rPr>
+          <w:rFonts w:cs="Times New Roman"/>
+        </w:rPr>
+        <w:t xml:space="preserve"> = −.03) or Factor 2 (</w:t>
+      </w:r>
+      <w:r>
+        <w:rPr>
+          <w:rFonts w:cs="Times New Roman"/>
+          <w:i/>
+        </w:rPr>
+        <w:t>r</w:t>
+      </w:r>
+      <w:r>
+        <w:rPr>
+          <w:rFonts w:cs="Times New Roman"/>
+        </w:rPr>
+        <w:t xml:space="preserve"> = −.15). Visual representation of loadings is presented in Figure 1.</w:t>
+      </w:r>
+    </w:p>
+    <w:p>
+      <w:pPr>
+        <w:spacing w:after="0" w:line="480" w:lineRule="auto"/>
+        <w:ind w:firstLine="720"/>
+        <w:rPr>
+          <w:rFonts w:cs="Times New Roman"/>
+        </w:rPr>
+      </w:pPr>
+      <w:r>
+        <w:rPr>
+          <w:rFonts w:cs="Times New Roman"/>
+        </w:rPr>
+        <w:t xml:space="preserve">The three-factor solution for the SME-generated items demonstrated the strongest overall model fit of the three item-generation approaches, χ²(150) = 183.17, </w:t>
+      </w:r>
+      <w:r>
+        <w:rPr>
+          <w:rFonts w:cs="Times New Roman"/>
+          <w:i/>
+        </w:rPr>
+        <w:t>p</w:t>
+      </w:r>
+      <w:r>
+        <w:rPr>
+          <w:rFonts w:cs="Times New Roman"/>
+        </w:rPr>
+        <w:t xml:space="preserve"> = .034, RMSEA = .048, 90% CI [.015, .071], CFI = .962, TLI = .947, and SRMR = .050. All three factors were significantly correlated at the 5% level threshold (</w:t>
+      </w:r>
+      <w:r>
+        <w:rPr>
+          <w:rFonts w:cs="Times New Roman"/>
+          <w:i/>
+        </w:rPr>
+        <w:t>p</w:t>
+      </w:r>
+      <w:r>
+        <w:rPr>
+          <w:rFonts w:cs="Times New Roman"/>
+        </w:rPr>
+        <w:t xml:space="preserve"> &lt; .05). Factor 1 correlated .44 with Factor 2 and .64 with Factor 3, while Factors 2 and 3 correlated .46. Overall, the three-factor model provided strong fit, although, like the AI-GENIE items, loadings did not create three distinct item groupings (see Figure 2).</w:t>
+      </w:r>
+    </w:p>
+    <w:p>
+      <w:pPr>
+        <w:spacing w:after="0" w:line="480" w:lineRule="auto"/>
+        <w:ind w:firstLine="720"/>
+        <w:rPr>
+          <w:rFonts w:cs="Times New Roman"/>
+        </w:rPr>
+      </w:pPr>
+      <w:r>
+        <w:rPr>
+          <w:rFonts w:cs="Times New Roman"/>
+        </w:rPr>
+        <w:t xml:space="preserve">The AI-GENIE-generated items demonstrated fair fit to the three-factor solution, χ²(150) = 207.64, </w:t>
+      </w:r>
+      <w:r>
+        <w:rPr>
+          <w:rFonts w:cs="Times New Roman"/>
+          <w:i/>
+        </w:rPr>
+        <w:t>p</w:t>
+      </w:r>
+      <w:r>
+        <w:rPr>
+          <w:rFonts w:cs="Times New Roman"/>
+        </w:rPr>
+        <w:t xml:space="preserve"> = .001, RMSEA = .064, 90% CI [.041, .084], CFI = .960, TLI = .944, and SRMR = .036. Item loading patterns provided partial support, with several non-hypothesized associations and substantive cross-loadings (see Figure 3 for a visual representation). Factors 1 and 2 exhibited a significant correlation (</w:t>
+      </w:r>
+      <w:r>
+        <w:rPr>
+          <w:rFonts w:cs="Times New Roman"/>
+          <w:i/>
+        </w:rPr>
+        <w:t>r</w:t>
+      </w:r>
+      <w:r>
+        <w:rPr>
+          <w:rFonts w:cs="Times New Roman"/>
+        </w:rPr>
+        <w:t xml:space="preserve"> = .76, </w:t>
+      </w:r>
+      <w:r>
+        <w:rPr>
+          <w:rFonts w:cs="Times New Roman"/>
+          <w:i/>
+        </w:rPr>
+        <w:t>p</w:t>
+      </w:r>
+      <w:r>
+        <w:rPr>
+          <w:rFonts w:cs="Times New Roman"/>
+        </w:rPr>
+        <w:t xml:space="preserve"> &lt; .05), whereas the correlations of Factor 3 with Factors 1 (</w:t>
+      </w:r>
+      <w:r>
+        <w:rPr>
+          <w:rFonts w:cs="Times New Roman"/>
+          <w:i/>
+        </w:rPr>
+        <w:t>r</w:t>
+      </w:r>
+      <w:r>
+        <w:rPr>
+          <w:rFonts w:cs="Times New Roman"/>
+        </w:rPr>
+        <w:t xml:space="preserve"> = .30) and 2 (</w:t>
+      </w:r>
+      <w:r>
+        <w:rPr>
+          <w:rFonts w:cs="Times New Roman"/>
+          <w:i/>
+        </w:rPr>
+        <w:t>r</w:t>
+      </w:r>
+      <w:r>
+        <w:rPr>
+          <w:rFonts w:cs="Times New Roman"/>
+        </w:rPr>
+        <w:t xml:space="preserve"> = .29) did not approach statistical significance. Overall, the three-factor model demonstrated relatively good fit, the loading pattern suggests two somewhat clear factors with item cross-loadings and an ambiguous third factor.</w:t>
+      </w:r>
+    </w:p>
+    <w:p>
+      <w:pPr>
+        <w:spacing w:after="0" w:line="480" w:lineRule="auto"/>
+        <w:ind w:firstLine="720"/>
+        <w:rPr>
+          <w:rFonts w:cs="Times New Roman"/>
+        </w:rPr>
+      </w:pPr>
+      <w:r>
+        <w:rPr>
+          <w:rFonts w:cs="Times New Roman"/>
+        </w:rPr>
+        <w:t xml:space="preserve">Taken together, these results point toward the ChatGPT-generated items as exhibiting the weakest traditional (empirical) evidence, with the observed structure largely not conforming to the theoretical associations. Additionally, the ChatGPT-generated items demonstrated worse model fit than the corresponding SME and AI-GENIE item sets, although </w:t>
+      </w:r>
+      <w:r>
+        <w:rPr>
+          <w:rFonts w:cs="Times New Roman"/>
+          <w:i/>
+        </w:rPr>
+        <w:t>none</w:t>
+      </w:r>
+      <w:r>
+        <w:rPr>
+          <w:rFonts w:cs="Times New Roman"/>
+        </w:rPr>
+        <w:t xml:space="preserve"> of the approaches satisfactorily converged on hypothesized associations (e.g., all extracted solutions exhibited a </w:t>
+      </w:r>
+      <w:r>
+        <w:rPr>
+          <w:rFonts w:cs="Times New Roman"/>
+        </w:rPr>
+        <w:lastRenderedPageBreak/>
+        <w:t>greater-than-desired number of cross-loadings and/or non-hypothesized item-dimension associations).</w:t>
       </w:r>
     </w:p>
     <w:p>
       <w:pPr>
         <w:keepNext/>
         <w:spacing w:after="0" w:line="480" w:lineRule="auto"/>
-        <w:jc w:val="center"/>
-        <w:rPr>
-          <w:rFonts w:cs="Times New Roman"/>
-        </w:rPr>
-      </w:pPr>
-      <w:r>
-        <w:rPr>
-          <w:rFonts w:cs="Times New Roman"/>
-          <w:b/>
-        </w:rPr>
-        <w:lastRenderedPageBreak/>
-        <w:t>Results</w:t>
-      </w:r>
-    </w:p>
-    <w:p>
-      <w:pPr>
-        <w:keepNext/>
-        <w:spacing w:after="0" w:line="480" w:lineRule="auto"/>
-        <w:rPr>
-          <w:rFonts w:cs="Times New Roman"/>
-        </w:rPr>
-      </w:pPr>
-      <w:r>
-        <w:rPr>
-          <w:rFonts w:cs="Times New Roman"/>
-          <w:b/>
-        </w:rPr>
-        <w:t>Traditional Analyses</w:t>
-      </w:r>
-    </w:p>
-    <w:p>
-      <w:pPr>
-        <w:spacing w:after="0" w:line="480" w:lineRule="auto"/>
-        <w:ind w:firstLine="720"/>
-        <w:rPr>
-          <w:rFonts w:cs="Times New Roman"/>
-        </w:rPr>
-      </w:pPr>
-      <w:r>
-        <w:rPr>
-          <w:rFonts w:cs="Times New Roman"/>
-        </w:rPr>
-        <w:t xml:space="preserve">Inter-scale correlations as well as scale means and standard deviations are presented in Table 1. Here, the Efficiency Seeking scales exhibit the least intra-dimension agreement (correlations across item-generation methodologies ranging from </w:t>
-      </w:r>
-      <w:r>
-        <w:rPr>
-          <w:rFonts w:cs="Times New Roman"/>
-          <w:i/>
-        </w:rPr>
-        <w:t>r</w:t>
-      </w:r>
-      <w:r>
-        <w:rPr>
-          <w:rFonts w:cs="Times New Roman"/>
-          <w:vertAlign w:val="subscript"/>
-        </w:rPr>
-        <w:t>GPT–SME</w:t>
-      </w:r>
-      <w:r>
-        <w:rPr>
-          <w:rFonts w:cs="Times New Roman"/>
-        </w:rPr>
-        <w:t xml:space="preserve"> = .14, </w:t>
-      </w:r>
-      <w:r>
-        <w:rPr>
-          <w:rFonts w:cs="Times New Roman"/>
-          <w:i/>
-        </w:rPr>
-        <w:t>ns</w:t>
-      </w:r>
-      <w:r>
-        <w:rPr>
-          <w:rFonts w:cs="Times New Roman"/>
-        </w:rPr>
-        <w:t xml:space="preserve"> to </w:t>
-      </w:r>
-      <w:r>
-        <w:rPr>
-          <w:rFonts w:cs="Times New Roman"/>
-          <w:i/>
-        </w:rPr>
-        <w:t>r</w:t>
-      </w:r>
-      <w:r>
-        <w:rPr>
-          <w:rFonts w:cs="Times New Roman"/>
-          <w:vertAlign w:val="subscript"/>
-        </w:rPr>
-        <w:t>GPT–Genie</w:t>
-      </w:r>
-      <w:r>
-        <w:rPr>
-          <w:rFonts w:cs="Times New Roman"/>
-        </w:rPr>
-        <w:t xml:space="preserve"> = .51, </w:t>
-      </w:r>
-      <w:r>
-        <w:rPr>
-          <w:rFonts w:cs="Times New Roman"/>
-          <w:i/>
-        </w:rPr>
-        <w:t>p</w:t>
-      </w:r>
-      <w:r>
-        <w:rPr>
-          <w:rFonts w:cs="Times New Roman"/>
-        </w:rPr>
-        <w:t xml:space="preserve"> &lt; .001). Pragmatic Integrator and Collaborative Optimiser scales exhibited consistently higher intra-dimension associations (ranging from a low of </w:t>
-      </w:r>
-      <w:r>
-        <w:rPr>
-          <w:rFonts w:cs="Times New Roman"/>
-          <w:i/>
-        </w:rPr>
-        <w:t>r</w:t>
-      </w:r>
-      <w:r>
-        <w:rPr>
-          <w:rFonts w:cs="Times New Roman"/>
-          <w:vertAlign w:val="subscript"/>
-        </w:rPr>
-        <w:t>Genie(CO)–SME(CO)</w:t>
-      </w:r>
-      <w:r>
-        <w:rPr>
-          <w:rFonts w:cs="Times New Roman"/>
-        </w:rPr>
-        <w:t xml:space="preserve"> = .76, </w:t>
-      </w:r>
-      <w:r>
-        <w:rPr>
-          <w:rFonts w:cs="Times New Roman"/>
-          <w:i/>
-        </w:rPr>
-        <w:t>p</w:t>
-      </w:r>
-      <w:r>
-        <w:rPr>
-          <w:rFonts w:cs="Times New Roman"/>
-        </w:rPr>
-        <w:t xml:space="preserve"> &lt; .001 to a high of </w:t>
-      </w:r>
-      <w:r>
-        <w:rPr>
-          <w:rFonts w:cs="Times New Roman"/>
-          <w:i/>
-        </w:rPr>
-        <w:t>r</w:t>
-      </w:r>
-      <w:r>
-        <w:rPr>
-          <w:rFonts w:cs="Times New Roman"/>
-          <w:vertAlign w:val="subscript"/>
-        </w:rPr>
-        <w:t>Genie(PI)–SME(PI)</w:t>
-      </w:r>
-      <w:r>
-        <w:rPr>
-          <w:rFonts w:cs="Times New Roman"/>
-        </w:rPr>
-        <w:t xml:space="preserve"> = .84, </w:t>
-      </w:r>
-      <w:r>
-        <w:rPr>
-          <w:rFonts w:cs="Times New Roman"/>
-          <w:i/>
-        </w:rPr>
-        <w:t>p</w:t>
-      </w:r>
-      <w:r>
-        <w:rPr>
-          <w:rFonts w:cs="Times New Roman"/>
-        </w:rPr>
-        <w:t xml:space="preserve"> &lt; .001). </w:t>
-      </w:r>
-      <w:r>
-        <w:rPr>
-          <w:rFonts w:cs="Times New Roman"/>
-          <w:i/>
-        </w:rPr>
-        <w:t>Lack</w:t>
-      </w:r>
-      <w:r>
-        <w:rPr>
-          <w:rFonts w:cs="Times New Roman"/>
-        </w:rPr>
-        <w:t xml:space="preserve"> of association with “other” scale dimensions was most prominent with the Efficiency Seeking scales, particularly so for the ChatGPT developed scale (and to a lesser degree, the SME-derived scale; e.g., the average magnitude of correlation was </w:t>
-      </w:r>
-      <w:r>
-        <w:rPr>
-          <w:rFonts w:cs="Times New Roman"/>
-          <w:i/>
-        </w:rPr>
-        <w:t>smallest</w:t>
-      </w:r>
-      <w:r>
-        <w:rPr>
-          <w:rFonts w:cs="Times New Roman"/>
-        </w:rPr>
-        <w:t>).</w:t>
-      </w:r>
-    </w:p>
-    <w:p>
-      <w:pPr>
-        <w:spacing w:after="0" w:line="480" w:lineRule="auto"/>
-        <w:ind w:firstLine="720"/>
-        <w:rPr>
-          <w:rFonts w:cs="Times New Roman"/>
-        </w:rPr>
-      </w:pPr>
-      <w:r>
-        <w:rPr>
-          <w:rFonts w:cs="Times New Roman"/>
-        </w:rPr>
-        <w:t>Individual scale alphas were predominantly within the .8 to .9 range, although two scales exhibited suppressed values (the ChatGPT Efficiency Seeking scale α = .69 and the SME Efficiency Seeking scale α = .59). Note that: 1) these are the two scales that also exhibited the lowest average inter-scale associations (see Table 1), and 2) the numbers of items differed across scales (</w:t>
-      </w:r>
-      <w:r>
-        <w:rPr>
-          <w:rFonts w:cs="Times New Roman"/>
-          <w:i/>
-        </w:rPr>
-        <w:t>k</w:t>
-      </w:r>
-      <w:r>
-        <w:rPr>
-          <w:rFonts w:cs="Times New Roman"/>
-          <w:vertAlign w:val="subscript"/>
-        </w:rPr>
-        <w:t>ChatGPT</w:t>
-      </w:r>
-      <w:r>
-        <w:rPr>
-          <w:rFonts w:cs="Times New Roman"/>
-        </w:rPr>
-        <w:t xml:space="preserve"> = 6, </w:t>
-      </w:r>
-      <w:r>
-        <w:rPr>
-          <w:rFonts w:cs="Times New Roman"/>
-          <w:i/>
-        </w:rPr>
-        <w:t>k</w:t>
-      </w:r>
-      <w:r>
-        <w:rPr>
-          <w:rFonts w:cs="Times New Roman"/>
-          <w:vertAlign w:val="subscript"/>
-        </w:rPr>
-        <w:t>SME</w:t>
-      </w:r>
-      <w:r>
-        <w:rPr>
-          <w:rFonts w:cs="Times New Roman"/>
-        </w:rPr>
-        <w:t xml:space="preserve"> = 7, and </w:t>
-      </w:r>
-      <w:r>
-        <w:rPr>
-          <w:rFonts w:cs="Times New Roman"/>
-          <w:i/>
-        </w:rPr>
-        <w:t>k</w:t>
-      </w:r>
-      <w:r>
-        <w:rPr>
-          <w:rFonts w:cs="Times New Roman"/>
-          <w:vertAlign w:val="subscript"/>
-        </w:rPr>
-        <w:t>AI-GENIE</w:t>
-      </w:r>
-      <w:r>
-        <w:rPr>
-          <w:rFonts w:cs="Times New Roman"/>
-        </w:rPr>
-        <w:t xml:space="preserve"> = 8). All scale αs are presented in Table 2.</w:t>
-      </w:r>
-    </w:p>
-    <w:p>
-      <w:pPr>
-        <w:spacing w:after="0" w:line="480" w:lineRule="auto"/>
-        <w:ind w:firstLine="720"/>
-        <w:rPr>
-          <w:rFonts w:cs="Times New Roman"/>
-        </w:rPr>
-      </w:pPr>
-      <w:r>
-        <w:rPr>
-          <w:rFonts w:cs="Times New Roman"/>
-        </w:rPr>
-        <w:t>Exploratory factor analyses (EFAs) were also conducted within item sets. One-, two-, and three-factor solutions were estimated for each item set using maximum likelihood estimation and an oblique Quartimin rotation. Following Hu and Bentler’s (1999) guidelines, model fit was evaluated using multiple indicators. The results presented here focus only on the three-factor models.</w:t>
-      </w:r>
-    </w:p>
-    <w:p>
-      <w:pPr>
-        <w:spacing w:after="0" w:line="480" w:lineRule="auto"/>
-        <w:ind w:firstLine="720"/>
-        <w:rPr>
-          <w:rFonts w:cs="Times New Roman"/>
-        </w:rPr>
-      </w:pPr>
-      <w:r>
-        <w:rPr>
-          <w:rFonts w:cs="Times New Roman"/>
-        </w:rPr>
-        <w:t xml:space="preserve">The three-factor model for the ChatGPT-generated items returned the weakest structural evidence (χ²(207) = 347.09, </w:t>
-      </w:r>
-      <w:r>
-        <w:rPr>
-          <w:rFonts w:cs="Times New Roman"/>
-          <w:i/>
-        </w:rPr>
-        <w:t>p</w:t>
-      </w:r>
-      <w:r>
-        <w:rPr>
-          <w:rFonts w:cs="Times New Roman"/>
-        </w:rPr>
-        <w:t xml:space="preserve"> &lt; .001, RMSEA = .084, 90% CI [.068, .099], CFI = .879, TLI = </w:t>
-      </w:r>
-      <w:r>
-        <w:rPr>
-          <w:rFonts w:cs="Times New Roman"/>
-        </w:rPr>
-        <w:lastRenderedPageBreak/>
-        <w:t>.838, and SRMR = .053). Factors 1 and 2 were significantly correlated (</w:t>
-      </w:r>
-      <w:r>
-        <w:rPr>
-          <w:rFonts w:cs="Times New Roman"/>
-          <w:i/>
-        </w:rPr>
-        <w:t>r</w:t>
-      </w:r>
-      <w:r>
-        <w:rPr>
-          <w:rFonts w:cs="Times New Roman"/>
-        </w:rPr>
-        <w:t xml:space="preserve"> = .48, </w:t>
-      </w:r>
-      <w:r>
-        <w:rPr>
-          <w:rFonts w:cs="Times New Roman"/>
-          <w:i/>
-        </w:rPr>
-        <w:t>p</w:t>
-      </w:r>
-      <w:r>
-        <w:rPr>
-          <w:rFonts w:cs="Times New Roman"/>
-        </w:rPr>
-        <w:t xml:space="preserve"> &lt; .05), while Factor 3 did not have a significant correlation with Factor 1 (</w:t>
-      </w:r>
-      <w:r>
-        <w:rPr>
-          <w:rFonts w:cs="Times New Roman"/>
-          <w:i/>
-        </w:rPr>
-        <w:t>r</w:t>
-      </w:r>
-      <w:r>
-        <w:rPr>
-          <w:rFonts w:cs="Times New Roman"/>
-        </w:rPr>
-        <w:t xml:space="preserve"> = −.03) or Factor 2 (</w:t>
-      </w:r>
-      <w:r>
-        <w:rPr>
-          <w:rFonts w:cs="Times New Roman"/>
-          <w:i/>
-        </w:rPr>
-        <w:t>r</w:t>
-      </w:r>
-      <w:r>
-        <w:rPr>
-          <w:rFonts w:cs="Times New Roman"/>
-        </w:rPr>
-        <w:t xml:space="preserve"> = −.15). Visual representation of loadings is presented in Figure 1.</w:t>
-      </w:r>
-    </w:p>
-    <w:p>
-      <w:pPr>
-        <w:spacing w:after="0" w:line="480" w:lineRule="auto"/>
-        <w:ind w:firstLine="720"/>
-        <w:rPr>
-          <w:rFonts w:cs="Times New Roman"/>
-        </w:rPr>
-      </w:pPr>
-      <w:r>
-        <w:rPr>
-          <w:rFonts w:cs="Times New Roman"/>
-        </w:rPr>
-        <w:t xml:space="preserve">The three-factor solution for the SME-generated items demonstrated the strongest overall model fit of the three item-generation approaches, χ²(150) = 183.17, </w:t>
-      </w:r>
-      <w:r>
-        <w:rPr>
-          <w:rFonts w:cs="Times New Roman"/>
-          <w:i/>
-        </w:rPr>
-        <w:t>p</w:t>
-      </w:r>
-      <w:r>
-        <w:rPr>
-          <w:rFonts w:cs="Times New Roman"/>
-        </w:rPr>
-        <w:t xml:space="preserve"> = .034, RMSEA = .048, 90% CI [.015, .071], CFI = .962, TLI = .947, and SRMR = .050. All three factors were significantly correlated at the 5% level threshold (</w:t>
-      </w:r>
-      <w:r>
-        <w:rPr>
-          <w:rFonts w:cs="Times New Roman"/>
-          <w:i/>
-        </w:rPr>
-        <w:t>p</w:t>
-      </w:r>
-      <w:r>
-        <w:rPr>
-          <w:rFonts w:cs="Times New Roman"/>
-        </w:rPr>
-        <w:t xml:space="preserve"> &lt; .05). Factor 1 correlated .44 with Factor 2 and .64 with Factor 3, while Factors 2 and 3 correlated .46. Overall, the three-factor model provided strong fit, although, like the AI-GENIE items, loadings did not create three distinct item groupings (see Figure 2).</w:t>
-      </w:r>
-    </w:p>
-    <w:p>
-      <w:pPr>
-        <w:spacing w:after="0" w:line="480" w:lineRule="auto"/>
-        <w:ind w:firstLine="720"/>
-        <w:rPr>
-          <w:rFonts w:cs="Times New Roman"/>
-        </w:rPr>
-      </w:pPr>
-      <w:r>
-        <w:rPr>
-          <w:rFonts w:cs="Times New Roman"/>
-        </w:rPr>
-        <w:t xml:space="preserve">The AI-GENIE-generated items demonstrated fair fit to the three-factor solution, χ²(150) = 207.64, </w:t>
-      </w:r>
-      <w:r>
-        <w:rPr>
-          <w:rFonts w:cs="Times New Roman"/>
-          <w:i/>
-        </w:rPr>
-        <w:t>p</w:t>
-      </w:r>
-      <w:r>
-        <w:rPr>
-          <w:rFonts w:cs="Times New Roman"/>
-        </w:rPr>
-        <w:t xml:space="preserve"> = .001, RMSEA = .064, 90% CI [.041, .084], CFI = .960, TLI = .944, and SRMR = .036. Item loading patterns provided partial support, with several non-hypothesized associations and substantive cross-loadings (see Figure 3 for a visual representation). Factors 1 and 2 exhibited a significant correlation (</w:t>
-      </w:r>
-      <w:r>
-        <w:rPr>
-          <w:rFonts w:cs="Times New Roman"/>
-          <w:i/>
-        </w:rPr>
-        <w:t>r</w:t>
-      </w:r>
-      <w:r>
-        <w:rPr>
-          <w:rFonts w:cs="Times New Roman"/>
-        </w:rPr>
-        <w:t xml:space="preserve"> = .76, </w:t>
-      </w:r>
-      <w:r>
-        <w:rPr>
-          <w:rFonts w:cs="Times New Roman"/>
-          <w:i/>
-        </w:rPr>
-        <w:t>p</w:t>
-      </w:r>
-      <w:r>
-        <w:rPr>
-          <w:rFonts w:cs="Times New Roman"/>
-        </w:rPr>
-        <w:t xml:space="preserve"> &lt; .05), whereas the correlations of Factor 3 with Factors 1 (</w:t>
-      </w:r>
-      <w:r>
-        <w:rPr>
-          <w:rFonts w:cs="Times New Roman"/>
-          <w:i/>
-        </w:rPr>
-        <w:t>r</w:t>
-      </w:r>
-      <w:r>
-        <w:rPr>
-          <w:rFonts w:cs="Times New Roman"/>
-        </w:rPr>
-        <w:t xml:space="preserve"> = .30) and 2 (</w:t>
-      </w:r>
-      <w:r>
-        <w:rPr>
-          <w:rFonts w:cs="Times New Roman"/>
-          <w:i/>
-        </w:rPr>
-        <w:t>r</w:t>
-      </w:r>
-      <w:r>
-        <w:rPr>
-          <w:rFonts w:cs="Times New Roman"/>
-        </w:rPr>
-        <w:t xml:space="preserve"> = .29) did not approach statistical significance. Overall, the three-factor model demonstrated relatively good fit, the loading pattern suggests two somewhat clear factors with item cross-loadings and an ambiguous third factor.</w:t>
-      </w:r>
-    </w:p>
-    <w:p>
-      <w:pPr>
-        <w:spacing w:after="0" w:line="480" w:lineRule="auto"/>
-        <w:ind w:firstLine="720"/>
-        <w:rPr>
-          <w:rFonts w:cs="Times New Roman"/>
-        </w:rPr>
-      </w:pPr>
-      <w:r>
-        <w:rPr>
-          <w:rFonts w:cs="Times New Roman"/>
-        </w:rPr>
-        <w:t xml:space="preserve">Taken together, these results point toward the ChatGPT-generated items as exhibiting the weakest traditional (empirical) evidence, with the observed structure largely not conforming to the theoretical associations. Additionally, the ChatGPT-generated items demonstrated worse model fit than the corresponding SME and AI-GENIE item sets, although </w:t>
-      </w:r>
-      <w:r>
-        <w:rPr>
-          <w:rFonts w:cs="Times New Roman"/>
-          <w:i/>
-        </w:rPr>
-        <w:t>none</w:t>
-      </w:r>
-      <w:r>
-        <w:rPr>
-          <w:rFonts w:cs="Times New Roman"/>
-        </w:rPr>
-        <w:t xml:space="preserve"> of the approaches satisfactorily converged on hypothesized associations (e.g., all extracted solutions exhibited a </w:t>
-      </w:r>
-      <w:r>
-        <w:rPr>
-          <w:rFonts w:cs="Times New Roman"/>
-        </w:rPr>
-        <w:lastRenderedPageBreak/>
-        <w:t>greater-than-desired number of cross-loadings and/or non-hypothesized item-dimension associations).</w:t>
-      </w:r>
-    </w:p>
-    <w:p>
-      <w:pPr>
-        <w:keepNext/>
-        <w:spacing w:after="0" w:line="480" w:lineRule="auto"/>
         <w:rPr>
           <w:rFonts w:cs="Times New Roman"/>
         </w:rPr>
@@ -1143,6 +1150,7 @@
           <w:rPr>
             <w:rStyle w:val="Hyperlink"/>
             <w:rFonts w:ascii="Times New Roman" w:hAnsi="Times New Roman" w:cs="Times New Roman"/>
+            <w:color w:val="auto"/>
           </w:rPr>
           <w:t>Borsboom, 2022</w:t>
         </w:r>
@@ -1158,6 +1166,7 @@
           <w:rPr>
             <w:rStyle w:val="Hyperlink"/>
             <w:rFonts w:ascii="Times New Roman" w:hAnsi="Times New Roman" w:cs="Times New Roman"/>
+            <w:color w:val="auto"/>
           </w:rPr>
           <w:t>Borsboom &amp; Cramer, 2013</w:t>
         </w:r>
@@ -1174,6 +1183,7 @@
           <w:rPr>
             <w:rStyle w:val="Hyperlink"/>
             <w:rFonts w:ascii="Times New Roman" w:hAnsi="Times New Roman" w:cs="Times New Roman"/>
+            <w:color w:val="auto"/>
           </w:rPr>
           <w:t>Epskamp</w:t>
         </w:r>
@@ -1182,6 +1192,7 @@
           <w:rPr>
             <w:rStyle w:val="Hyperlink"/>
             <w:rFonts w:ascii="Times New Roman" w:hAnsi="Times New Roman" w:cs="Times New Roman"/>
+            <w:color w:val="auto"/>
           </w:rPr>
           <w:t xml:space="preserve"> et al., 2018</w:t>
         </w:r>
@@ -1241,6 +1252,7 @@
           <w:rPr>
             <w:rStyle w:val="Hyperlink"/>
             <w:rFonts w:cs="Times New Roman"/>
+            <w:color w:val="auto"/>
           </w:rPr>
           <w:t>Figure 4</w:t>
         </w:r>
@@ -1256,6 +1268,7 @@
           <w:rPr>
             <w:rStyle w:val="Hyperlink"/>
             <w:rFonts w:cs="Times New Roman"/>
+            <w:color w:val="auto"/>
           </w:rPr>
           <w:t>Figure 5</w:t>
         </w:r>
@@ -1271,6 +1284,7 @@
           <w:rPr>
             <w:rStyle w:val="Hyperlink"/>
             <w:rFonts w:cs="Times New Roman"/>
+            <w:color w:val="auto"/>
           </w:rPr>
           <w:t>Figure 6</w:t>
         </w:r>
@@ -1402,6 +1416,7 @@
           <w:rPr>
             <w:rStyle w:val="Hyperlink"/>
             <w:rFonts w:ascii="Times New Roman" w:hAnsi="Times New Roman" w:cs="Times New Roman"/>
+            <w:color w:val="auto"/>
           </w:rPr>
           <w:t>2025</w:t>
         </w:r>
@@ -1485,6 +1500,7 @@
           <w:rPr>
             <w:rStyle w:val="Hyperlink"/>
             <w:rFonts w:cs="Times New Roman"/>
+            <w:color w:val="auto"/>
           </w:rPr>
           <w:t>Figure 1</w:t>
         </w:r>
@@ -1528,6 +1544,7 @@
           <w:rPr>
             <w:rStyle w:val="Hyperlink"/>
             <w:rFonts w:cs="Times New Roman"/>
+            <w:color w:val="auto"/>
           </w:rPr>
           <w:t>2025</w:t>
         </w:r>
@@ -4468,10 +4485,10 @@
         </w:rPr>
         <w:lastRenderedPageBreak/>
         <w:drawing>
-          <wp:inline distT="0" distB="0" distL="0" distR="0" wp14:anchorId="14F7DD41" wp14:editId="03EFCA5A">
+          <wp:inline distT="0" distB="0" distL="0" distR="0" wp14:anchorId="14F7DD41" wp14:editId="105789D8">
             <wp:extent cx="5486400" cy="5486400"/>
             <wp:effectExtent l="0" t="0" r="0" b="0"/>
-            <wp:docPr id="1" name="Picture 1"/>
+            <wp:docPr id="1" name="Picture 1" descr="P230#yIS1"/>
             <wp:cNvGraphicFramePr>
               <a:graphicFrameLocks xmlns:a="http://schemas.openxmlformats.org/drawingml/2006/main" noChangeAspect="1"/>
             </wp:cNvGraphicFramePr>
@@ -4479,7 +4496,7 @@
               <a:graphicData uri="http://schemas.openxmlformats.org/drawingml/2006/picture">
                 <pic:pic xmlns:pic="http://schemas.openxmlformats.org/drawingml/2006/picture">
                   <pic:nvPicPr>
-                    <pic:cNvPr id="0" name="image1.png"/>
+                    <pic:cNvPr id="1" name="Picture 1" descr="P230#yIS1"/>
                     <pic:cNvPicPr/>
                   </pic:nvPicPr>
                   <pic:blipFill>
@@ -4548,10 +4565,10 @@
         </w:rPr>
         <w:lastRenderedPageBreak/>
         <w:drawing>
-          <wp:inline distT="0" distB="0" distL="0" distR="0" wp14:anchorId="213299F7" wp14:editId="2D496635">
+          <wp:inline distT="0" distB="0" distL="0" distR="0" wp14:anchorId="213299F7" wp14:editId="094FCACF">
             <wp:extent cx="5486400" cy="5486400"/>
             <wp:effectExtent l="0" t="0" r="0" b="0"/>
-            <wp:docPr id="2" name="Picture 2"/>
+            <wp:docPr id="2" name="Picture 2" descr="P233#yIS1"/>
             <wp:cNvGraphicFramePr>
               <a:graphicFrameLocks xmlns:a="http://schemas.openxmlformats.org/drawingml/2006/main" noChangeAspect="1"/>
             </wp:cNvGraphicFramePr>
@@ -4559,7 +4576,7 @@
               <a:graphicData uri="http://schemas.openxmlformats.org/drawingml/2006/picture">
                 <pic:pic xmlns:pic="http://schemas.openxmlformats.org/drawingml/2006/picture">
                   <pic:nvPicPr>
-                    <pic:cNvPr id="0" name="image2.png"/>
+                    <pic:cNvPr id="2" name="Picture 2" descr="P233#yIS1"/>
                     <pic:cNvPicPr/>
                   </pic:nvPicPr>
                   <pic:blipFill>
@@ -4628,10 +4645,10 @@
         </w:rPr>
         <w:lastRenderedPageBreak/>
         <w:drawing>
-          <wp:inline distT="0" distB="0" distL="0" distR="0" wp14:anchorId="73E2D20C" wp14:editId="5FA10B8C">
+          <wp:inline distT="0" distB="0" distL="0" distR="0" wp14:anchorId="73E2D20C" wp14:editId="55242889">
             <wp:extent cx="5486400" cy="5486400"/>
             <wp:effectExtent l="0" t="0" r="0" b="0"/>
-            <wp:docPr id="3" name="Picture 3"/>
+            <wp:docPr id="3" name="Picture 3" descr="P236#yIS1"/>
             <wp:cNvGraphicFramePr>
               <a:graphicFrameLocks xmlns:a="http://schemas.openxmlformats.org/drawingml/2006/main" noChangeAspect="1"/>
             </wp:cNvGraphicFramePr>
@@ -4639,7 +4656,7 @@
               <a:graphicData uri="http://schemas.openxmlformats.org/drawingml/2006/picture">
                 <pic:pic xmlns:pic="http://schemas.openxmlformats.org/drawingml/2006/picture">
                   <pic:nvPicPr>
-                    <pic:cNvPr id="0" name="image3.png"/>
+                    <pic:cNvPr id="3" name="Picture 3" descr="P236#yIS1"/>
                     <pic:cNvPicPr/>
                   </pic:nvPicPr>
                   <pic:blipFill>
@@ -4708,10 +4725,10 @@
         </w:rPr>
         <w:lastRenderedPageBreak/>
         <w:drawing>
-          <wp:inline distT="0" distB="0" distL="0" distR="0" wp14:anchorId="4044D6FF" wp14:editId="2BF8C603">
+          <wp:inline distT="0" distB="0" distL="0" distR="0" wp14:anchorId="4044D6FF" wp14:editId="6733F898">
             <wp:extent cx="5486400" cy="5486400"/>
             <wp:effectExtent l="0" t="0" r="0" b="0"/>
-            <wp:docPr id="4" name="Picture 4"/>
+            <wp:docPr id="4" name="Picture 4" descr="P239#yIS1"/>
             <wp:cNvGraphicFramePr>
               <a:graphicFrameLocks xmlns:a="http://schemas.openxmlformats.org/drawingml/2006/main" noChangeAspect="1"/>
             </wp:cNvGraphicFramePr>
@@ -4719,7 +4736,7 @@
               <a:graphicData uri="http://schemas.openxmlformats.org/drawingml/2006/picture">
                 <pic:pic xmlns:pic="http://schemas.openxmlformats.org/drawingml/2006/picture">
                   <pic:nvPicPr>
-                    <pic:cNvPr id="0" name="image4.png"/>
+                    <pic:cNvPr id="4" name="Picture 4" descr="P239#yIS1"/>
                     <pic:cNvPicPr/>
                   </pic:nvPicPr>
                   <pic:blipFill>
@@ -4788,10 +4805,10 @@
         </w:rPr>
         <w:lastRenderedPageBreak/>
         <w:drawing>
-          <wp:inline distT="0" distB="0" distL="0" distR="0" wp14:anchorId="01D11E9C" wp14:editId="4E8FFF04">
+          <wp:inline distT="0" distB="0" distL="0" distR="0" wp14:anchorId="01D11E9C" wp14:editId="4FD4BD7A">
             <wp:extent cx="5486400" cy="5486400"/>
             <wp:effectExtent l="0" t="0" r="0" b="0"/>
-            <wp:docPr id="5" name="Picture 5"/>
+            <wp:docPr id="5" name="Picture 5" descr="P242#yIS1"/>
             <wp:cNvGraphicFramePr>
               <a:graphicFrameLocks xmlns:a="http://schemas.openxmlformats.org/drawingml/2006/main" noChangeAspect="1"/>
             </wp:cNvGraphicFramePr>
@@ -4799,7 +4816,7 @@
               <a:graphicData uri="http://schemas.openxmlformats.org/drawingml/2006/picture">
                 <pic:pic xmlns:pic="http://schemas.openxmlformats.org/drawingml/2006/picture">
                   <pic:nvPicPr>
-                    <pic:cNvPr id="0" name="image5.png"/>
+                    <pic:cNvPr id="5" name="Picture 5" descr="P242#yIS1"/>
                     <pic:cNvPicPr/>
                   </pic:nvPicPr>
                   <pic:blipFill>
@@ -4868,10 +4885,10 @@
         </w:rPr>
         <w:lastRenderedPageBreak/>
         <w:drawing>
-          <wp:inline distT="0" distB="0" distL="0" distR="0" wp14:anchorId="05372D14" wp14:editId="30C8FC9B">
+          <wp:inline distT="0" distB="0" distL="0" distR="0" wp14:anchorId="05372D14" wp14:editId="2F75DE7E">
             <wp:extent cx="5486400" cy="5486400"/>
             <wp:effectExtent l="0" t="0" r="0" b="0"/>
-            <wp:docPr id="6" name="Picture 6"/>
+            <wp:docPr id="6" name="Picture 6" descr="P245#yIS1"/>
             <wp:cNvGraphicFramePr>
               <a:graphicFrameLocks xmlns:a="http://schemas.openxmlformats.org/drawingml/2006/main" noChangeAspect="1"/>
             </wp:cNvGraphicFramePr>
@@ -4879,7 +4896,7 @@
               <a:graphicData uri="http://schemas.openxmlformats.org/drawingml/2006/picture">
                 <pic:pic xmlns:pic="http://schemas.openxmlformats.org/drawingml/2006/picture">
                   <pic:nvPicPr>
-                    <pic:cNvPr id="0" name="image6.png"/>
+                    <pic:cNvPr id="6" name="Picture 6" descr="P245#yIS1"/>
                     <pic:cNvPicPr/>
                   </pic:nvPicPr>
                   <pic:blipFill>
@@ -5034,10 +5051,11 @@
   <w:abstractNum w:abstractNumId="0" w15:restartNumberingAfterBreak="0">
     <w:nsid w:val="FFFFFF7C"/>
     <w:multiLevelType w:val="singleLevel"/>
-    <w:tmpl w:val="C310EC42"/>
+    <w:tmpl w:val="F57E93EE"/>
     <w:lvl w:ilvl="0">
       <w:start w:val="1"/>
       <w:numFmt w:val="decimal"/>
+      <w:pStyle w:val="ListNumber5"/>
       <w:lvlText w:val="%1."/>
       <w:lvlJc w:val="left"/>
       <w:pPr>
@@ -5051,10 +5069,11 @@
   <w:abstractNum w:abstractNumId="1" w15:restartNumberingAfterBreak="0">
     <w:nsid w:val="FFFFFF7D"/>
     <w:multiLevelType w:val="singleLevel"/>
-    <w:tmpl w:val="E4089024"/>
+    <w:tmpl w:val="8354C368"/>
     <w:lvl w:ilvl="0">
       <w:start w:val="1"/>
       <w:numFmt w:val="decimal"/>
+      <w:pStyle w:val="ListNumber4"/>
       <w:lvlText w:val="%1."/>
       <w:lvlJc w:val="left"/>
       <w:pPr>
@@ -5102,12 +5121,34 @@
     </w:lvl>
   </w:abstractNum>
   <w:abstractNum w:abstractNumId="4" w15:restartNumberingAfterBreak="0">
-    <w:nsid w:val="FFFFFF81"/>
+    <w:nsid w:val="FFFFFF80"/>
     <w:multiLevelType w:val="singleLevel"/>
-    <w:tmpl w:val="171AC3A4"/>
+    <w:tmpl w:val="26BC4CFA"/>
     <w:lvl w:ilvl="0">
       <w:start w:val="1"/>
       <w:numFmt w:val="bullet"/>
+      <w:pStyle w:val="ListBullet5"/>
+      <w:lvlText w:val=""/>
+      <w:lvlJc w:val="left"/>
+      <w:pPr>
+        <w:tabs>
+          <w:tab w:val="num" w:pos="1800"/>
+        </w:tabs>
+        <w:ind w:left="1800" w:hanging="360"/>
+      </w:pPr>
+      <w:rPr>
+        <w:rFonts w:ascii="Symbol" w:hAnsi="Symbol" w:hint="default"/>
+      </w:rPr>
+    </w:lvl>
+  </w:abstractNum>
+  <w:abstractNum w:abstractNumId="5" w15:restartNumberingAfterBreak="0">
+    <w:nsid w:val="FFFFFF81"/>
+    <w:multiLevelType w:val="singleLevel"/>
+    <w:tmpl w:val="32066E7A"/>
+    <w:lvl w:ilvl="0">
+      <w:start w:val="1"/>
+      <w:numFmt w:val="bullet"/>
+      <w:pStyle w:val="ListBullet4"/>
       <w:lvlText w:val=""/>
       <w:lvlJc w:val="left"/>
       <w:pPr>
@@ -5121,7 +5162,7 @@
       </w:rPr>
     </w:lvl>
   </w:abstractNum>
-  <w:abstractNum w:abstractNumId="5" w15:restartNumberingAfterBreak="0">
+  <w:abstractNum w:abstractNumId="6" w15:restartNumberingAfterBreak="0">
     <w:nsid w:val="FFFFFF82"/>
     <w:multiLevelType w:val="singleLevel"/>
     <w:tmpl w:val="F3EAFDEC"/>
@@ -5142,7 +5183,7 @@
       </w:rPr>
     </w:lvl>
   </w:abstractNum>
-  <w:abstractNum w:abstractNumId="6" w15:restartNumberingAfterBreak="0">
+  <w:abstractNum w:abstractNumId="7" w15:restartNumberingAfterBreak="0">
     <w:nsid w:val="FFFFFF83"/>
     <w:multiLevelType w:val="singleLevel"/>
     <w:tmpl w:val="3D1EFFD4"/>
@@ -5163,7 +5204,7 @@
       </w:rPr>
     </w:lvl>
   </w:abstractNum>
-  <w:abstractNum w:abstractNumId="7" w15:restartNumberingAfterBreak="0">
+  <w:abstractNum w:abstractNumId="8" w15:restartNumberingAfterBreak="0">
     <w:nsid w:val="FFFFFF88"/>
     <w:multiLevelType w:val="singleLevel"/>
     <w:tmpl w:val="D0A62B40"/>
@@ -5181,7 +5222,7 @@
       </w:pPr>
     </w:lvl>
   </w:abstractNum>
-  <w:abstractNum w:abstractNumId="8" w15:restartNumberingAfterBreak="0">
+  <w:abstractNum w:abstractNumId="9" w15:restartNumberingAfterBreak="0">
     <w:nsid w:val="FFFFFF89"/>
     <w:multiLevelType w:val="singleLevel"/>
     <w:tmpl w:val="29761A62"/>
@@ -5203,19 +5244,19 @@
     </w:lvl>
   </w:abstractNum>
   <w:num w:numId="1" w16cid:durableId="661274379">
-    <w:abstractNumId w:val="8"/>
+    <w:abstractNumId w:val="9"/>
   </w:num>
   <w:num w:numId="2" w16cid:durableId="1275406628">
+    <w:abstractNumId w:val="7"/>
+  </w:num>
+  <w:num w:numId="3" w16cid:durableId="749623418">
     <w:abstractNumId w:val="6"/>
   </w:num>
-  <w:num w:numId="3" w16cid:durableId="749623418">
+  <w:num w:numId="4" w16cid:durableId="224800424">
     <w:abstractNumId w:val="5"/>
   </w:num>
-  <w:num w:numId="4" w16cid:durableId="224800424">
-    <w:abstractNumId w:val="4"/>
-  </w:num>
   <w:num w:numId="5" w16cid:durableId="406269438">
-    <w:abstractNumId w:val="7"/>
+    <w:abstractNumId w:val="8"/>
   </w:num>
   <w:num w:numId="6" w16cid:durableId="245000156">
     <w:abstractNumId w:val="3"/>
@@ -5227,6 +5268,15 @@
     <w:abstractNumId w:val="1"/>
   </w:num>
   <w:num w:numId="9" w16cid:durableId="1149056678">
+    <w:abstractNumId w:val="0"/>
+  </w:num>
+  <w:num w:numId="10" w16cid:durableId="492455313">
+    <w:abstractNumId w:val="4"/>
+  </w:num>
+  <w:num w:numId="11" w16cid:durableId="1477255681">
+    <w:abstractNumId w:val="1"/>
+  </w:num>
+  <w:num w:numId="12" w16cid:durableId="935670373">
     <w:abstractNumId w:val="0"/>
   </w:num>
 </w:numbering>
@@ -16639,6 +16689,1085 @@
       <w:szCs w:val="24"/>
     </w:rPr>
   </w:style>
+  <w:style w:type="paragraph" w:styleId="BalloonText">
+    <w:name w:val="Balloon Text"/>
+    <w:basedOn w:val="Normal"/>
+    <w:link w:val="BalloonTextChar"/>
+    <w:uiPriority w:val="99"/>
+    <w:semiHidden/>
+    <w:unhideWhenUsed/>
+    <w:rsid w:val="001210B4"/>
+    <w:pPr>
+      <w:spacing w:after="0" w:line="240" w:lineRule="auto"/>
+    </w:pPr>
+    <w:rPr>
+      <w:rFonts w:ascii="Segoe UI" w:hAnsi="Segoe UI" w:cs="Segoe UI"/>
+      <w:sz w:val="18"/>
+      <w:szCs w:val="18"/>
+    </w:rPr>
+  </w:style>
+  <w:style w:type="character" w:customStyle="1" w:styleId="BalloonTextChar">
+    <w:name w:val="Balloon Text Char"/>
+    <w:basedOn w:val="DefaultParagraphFont"/>
+    <w:link w:val="BalloonText"/>
+    <w:uiPriority w:val="99"/>
+    <w:semiHidden/>
+    <w:rsid w:val="001210B4"/>
+    <w:rPr>
+      <w:rFonts w:ascii="Segoe UI" w:eastAsia="Times New Roman" w:hAnsi="Segoe UI" w:cs="Segoe UI"/>
+      <w:sz w:val="18"/>
+      <w:szCs w:val="18"/>
+    </w:rPr>
+  </w:style>
+  <w:style w:type="paragraph" w:styleId="Bibliography">
+    <w:name w:val="Bibliography"/>
+    <w:basedOn w:val="Normal"/>
+    <w:next w:val="Normal"/>
+    <w:uiPriority w:val="37"/>
+    <w:semiHidden/>
+    <w:unhideWhenUsed/>
+    <w:rsid w:val="001210B4"/>
+  </w:style>
+  <w:style w:type="paragraph" w:styleId="BlockText">
+    <w:name w:val="Block Text"/>
+    <w:basedOn w:val="Normal"/>
+    <w:uiPriority w:val="99"/>
+    <w:semiHidden/>
+    <w:unhideWhenUsed/>
+    <w:rsid w:val="001210B4"/>
+    <w:pPr>
+      <w:pBdr>
+        <w:top w:val="single" w:sz="2" w:space="10" w:color="4F81BD" w:themeColor="accent1"/>
+        <w:left w:val="single" w:sz="2" w:space="10" w:color="4F81BD" w:themeColor="accent1"/>
+        <w:bottom w:val="single" w:sz="2" w:space="10" w:color="4F81BD" w:themeColor="accent1"/>
+        <w:right w:val="single" w:sz="2" w:space="10" w:color="4F81BD" w:themeColor="accent1"/>
+      </w:pBdr>
+      <w:ind w:left="1152" w:right="1152"/>
+    </w:pPr>
+    <w:rPr>
+      <w:rFonts w:asciiTheme="minorHAnsi" w:eastAsiaTheme="minorEastAsia" w:hAnsiTheme="minorHAnsi"/>
+      <w:i/>
+      <w:iCs/>
+      <w:color w:val="4F81BD" w:themeColor="accent1"/>
+    </w:rPr>
+  </w:style>
+  <w:style w:type="paragraph" w:styleId="BodyTextFirstIndent">
+    <w:name w:val="Body Text First Indent"/>
+    <w:basedOn w:val="BodyText"/>
+    <w:link w:val="BodyTextFirstIndentChar"/>
+    <w:uiPriority w:val="99"/>
+    <w:semiHidden/>
+    <w:unhideWhenUsed/>
+    <w:rsid w:val="001210B4"/>
+    <w:pPr>
+      <w:spacing w:after="200"/>
+      <w:ind w:firstLine="360"/>
+    </w:pPr>
+  </w:style>
+  <w:style w:type="character" w:customStyle="1" w:styleId="BodyTextFirstIndentChar">
+    <w:name w:val="Body Text First Indent Char"/>
+    <w:basedOn w:val="BodyTextChar"/>
+    <w:link w:val="BodyTextFirstIndent"/>
+    <w:uiPriority w:val="99"/>
+    <w:semiHidden/>
+    <w:rsid w:val="001210B4"/>
+    <w:rPr>
+      <w:rFonts w:ascii="Times New Roman" w:eastAsia="Times New Roman" w:hAnsi="Times New Roman"/>
+      <w:sz w:val="24"/>
+    </w:rPr>
+  </w:style>
+  <w:style w:type="paragraph" w:styleId="BodyTextIndent">
+    <w:name w:val="Body Text Indent"/>
+    <w:basedOn w:val="Normal"/>
+    <w:link w:val="BodyTextIndentChar"/>
+    <w:uiPriority w:val="99"/>
+    <w:semiHidden/>
+    <w:unhideWhenUsed/>
+    <w:rsid w:val="001210B4"/>
+    <w:pPr>
+      <w:spacing w:after="120"/>
+      <w:ind w:left="360"/>
+    </w:pPr>
+  </w:style>
+  <w:style w:type="character" w:customStyle="1" w:styleId="BodyTextIndentChar">
+    <w:name w:val="Body Text Indent Char"/>
+    <w:basedOn w:val="DefaultParagraphFont"/>
+    <w:link w:val="BodyTextIndent"/>
+    <w:uiPriority w:val="99"/>
+    <w:semiHidden/>
+    <w:rsid w:val="001210B4"/>
+    <w:rPr>
+      <w:rFonts w:ascii="Times New Roman" w:eastAsia="Times New Roman" w:hAnsi="Times New Roman"/>
+      <w:sz w:val="24"/>
+    </w:rPr>
+  </w:style>
+  <w:style w:type="paragraph" w:styleId="BodyTextFirstIndent2">
+    <w:name w:val="Body Text First Indent 2"/>
+    <w:basedOn w:val="BodyTextIndent"/>
+    <w:link w:val="BodyTextFirstIndent2Char"/>
+    <w:uiPriority w:val="99"/>
+    <w:semiHidden/>
+    <w:unhideWhenUsed/>
+    <w:rsid w:val="001210B4"/>
+    <w:pPr>
+      <w:spacing w:after="200"/>
+      <w:ind w:firstLine="360"/>
+    </w:pPr>
+  </w:style>
+  <w:style w:type="character" w:customStyle="1" w:styleId="BodyTextFirstIndent2Char">
+    <w:name w:val="Body Text First Indent 2 Char"/>
+    <w:basedOn w:val="BodyTextIndentChar"/>
+    <w:link w:val="BodyTextFirstIndent2"/>
+    <w:uiPriority w:val="99"/>
+    <w:semiHidden/>
+    <w:rsid w:val="001210B4"/>
+    <w:rPr>
+      <w:rFonts w:ascii="Times New Roman" w:eastAsia="Times New Roman" w:hAnsi="Times New Roman"/>
+      <w:sz w:val="24"/>
+    </w:rPr>
+  </w:style>
+  <w:style w:type="paragraph" w:styleId="BodyTextIndent2">
+    <w:name w:val="Body Text Indent 2"/>
+    <w:basedOn w:val="Normal"/>
+    <w:link w:val="BodyTextIndent2Char"/>
+    <w:uiPriority w:val="99"/>
+    <w:semiHidden/>
+    <w:unhideWhenUsed/>
+    <w:rsid w:val="001210B4"/>
+    <w:pPr>
+      <w:spacing w:after="120" w:line="480" w:lineRule="auto"/>
+      <w:ind w:left="360"/>
+    </w:pPr>
+  </w:style>
+  <w:style w:type="character" w:customStyle="1" w:styleId="BodyTextIndent2Char">
+    <w:name w:val="Body Text Indent 2 Char"/>
+    <w:basedOn w:val="DefaultParagraphFont"/>
+    <w:link w:val="BodyTextIndent2"/>
+    <w:uiPriority w:val="99"/>
+    <w:semiHidden/>
+    <w:rsid w:val="001210B4"/>
+    <w:rPr>
+      <w:rFonts w:ascii="Times New Roman" w:eastAsia="Times New Roman" w:hAnsi="Times New Roman"/>
+      <w:sz w:val="24"/>
+    </w:rPr>
+  </w:style>
+  <w:style w:type="paragraph" w:styleId="BodyTextIndent3">
+    <w:name w:val="Body Text Indent 3"/>
+    <w:basedOn w:val="Normal"/>
+    <w:link w:val="BodyTextIndent3Char"/>
+    <w:uiPriority w:val="99"/>
+    <w:semiHidden/>
+    <w:unhideWhenUsed/>
+    <w:rsid w:val="001210B4"/>
+    <w:pPr>
+      <w:spacing w:after="120"/>
+      <w:ind w:left="360"/>
+    </w:pPr>
+    <w:rPr>
+      <w:sz w:val="16"/>
+      <w:szCs w:val="16"/>
+    </w:rPr>
+  </w:style>
+  <w:style w:type="character" w:customStyle="1" w:styleId="BodyTextIndent3Char">
+    <w:name w:val="Body Text Indent 3 Char"/>
+    <w:basedOn w:val="DefaultParagraphFont"/>
+    <w:link w:val="BodyTextIndent3"/>
+    <w:uiPriority w:val="99"/>
+    <w:semiHidden/>
+    <w:rsid w:val="001210B4"/>
+    <w:rPr>
+      <w:rFonts w:ascii="Times New Roman" w:eastAsia="Times New Roman" w:hAnsi="Times New Roman"/>
+      <w:sz w:val="16"/>
+      <w:szCs w:val="16"/>
+    </w:rPr>
+  </w:style>
+  <w:style w:type="paragraph" w:styleId="Closing">
+    <w:name w:val="Closing"/>
+    <w:basedOn w:val="Normal"/>
+    <w:link w:val="ClosingChar"/>
+    <w:uiPriority w:val="99"/>
+    <w:semiHidden/>
+    <w:unhideWhenUsed/>
+    <w:rsid w:val="001210B4"/>
+    <w:pPr>
+      <w:spacing w:after="0" w:line="240" w:lineRule="auto"/>
+      <w:ind w:left="4320"/>
+    </w:pPr>
+  </w:style>
+  <w:style w:type="character" w:customStyle="1" w:styleId="ClosingChar">
+    <w:name w:val="Closing Char"/>
+    <w:basedOn w:val="DefaultParagraphFont"/>
+    <w:link w:val="Closing"/>
+    <w:uiPriority w:val="99"/>
+    <w:semiHidden/>
+    <w:rsid w:val="001210B4"/>
+    <w:rPr>
+      <w:rFonts w:ascii="Times New Roman" w:eastAsia="Times New Roman" w:hAnsi="Times New Roman"/>
+      <w:sz w:val="24"/>
+    </w:rPr>
+  </w:style>
+  <w:style w:type="paragraph" w:styleId="CommentText">
+    <w:name w:val="annotation text"/>
+    <w:basedOn w:val="Normal"/>
+    <w:link w:val="CommentTextChar"/>
+    <w:uiPriority w:val="99"/>
+    <w:semiHidden/>
+    <w:unhideWhenUsed/>
+    <w:rsid w:val="001210B4"/>
+    <w:pPr>
+      <w:spacing w:line="240" w:lineRule="auto"/>
+    </w:pPr>
+    <w:rPr>
+      <w:sz w:val="20"/>
+      <w:szCs w:val="20"/>
+    </w:rPr>
+  </w:style>
+  <w:style w:type="character" w:customStyle="1" w:styleId="CommentTextChar">
+    <w:name w:val="Comment Text Char"/>
+    <w:basedOn w:val="DefaultParagraphFont"/>
+    <w:link w:val="CommentText"/>
+    <w:uiPriority w:val="99"/>
+    <w:semiHidden/>
+    <w:rsid w:val="001210B4"/>
+    <w:rPr>
+      <w:rFonts w:ascii="Times New Roman" w:eastAsia="Times New Roman" w:hAnsi="Times New Roman"/>
+      <w:sz w:val="20"/>
+      <w:szCs w:val="20"/>
+    </w:rPr>
+  </w:style>
+  <w:style w:type="paragraph" w:styleId="CommentSubject">
+    <w:name w:val="annotation subject"/>
+    <w:basedOn w:val="CommentText"/>
+    <w:next w:val="CommentText"/>
+    <w:link w:val="CommentSubjectChar"/>
+    <w:uiPriority w:val="99"/>
+    <w:semiHidden/>
+    <w:unhideWhenUsed/>
+    <w:rsid w:val="001210B4"/>
+    <w:rPr>
+      <w:b/>
+      <w:bCs/>
+    </w:rPr>
+  </w:style>
+  <w:style w:type="character" w:customStyle="1" w:styleId="CommentSubjectChar">
+    <w:name w:val="Comment Subject Char"/>
+    <w:basedOn w:val="CommentTextChar"/>
+    <w:link w:val="CommentSubject"/>
+    <w:uiPriority w:val="99"/>
+    <w:semiHidden/>
+    <w:rsid w:val="001210B4"/>
+    <w:rPr>
+      <w:rFonts w:ascii="Times New Roman" w:eastAsia="Times New Roman" w:hAnsi="Times New Roman"/>
+      <w:b/>
+      <w:bCs/>
+      <w:sz w:val="20"/>
+      <w:szCs w:val="20"/>
+    </w:rPr>
+  </w:style>
+  <w:style w:type="paragraph" w:styleId="Date">
+    <w:name w:val="Date"/>
+    <w:basedOn w:val="Normal"/>
+    <w:next w:val="Normal"/>
+    <w:link w:val="DateChar"/>
+    <w:uiPriority w:val="99"/>
+    <w:semiHidden/>
+    <w:unhideWhenUsed/>
+    <w:rsid w:val="001210B4"/>
+  </w:style>
+  <w:style w:type="character" w:customStyle="1" w:styleId="DateChar">
+    <w:name w:val="Date Char"/>
+    <w:basedOn w:val="DefaultParagraphFont"/>
+    <w:link w:val="Date"/>
+    <w:uiPriority w:val="99"/>
+    <w:semiHidden/>
+    <w:rsid w:val="001210B4"/>
+    <w:rPr>
+      <w:rFonts w:ascii="Times New Roman" w:eastAsia="Times New Roman" w:hAnsi="Times New Roman"/>
+      <w:sz w:val="24"/>
+    </w:rPr>
+  </w:style>
+  <w:style w:type="paragraph" w:styleId="DocumentMap">
+    <w:name w:val="Document Map"/>
+    <w:basedOn w:val="Normal"/>
+    <w:link w:val="DocumentMapChar"/>
+    <w:uiPriority w:val="99"/>
+    <w:semiHidden/>
+    <w:unhideWhenUsed/>
+    <w:rsid w:val="001210B4"/>
+    <w:pPr>
+      <w:spacing w:after="0" w:line="240" w:lineRule="auto"/>
+    </w:pPr>
+    <w:rPr>
+      <w:rFonts w:ascii="Segoe UI" w:hAnsi="Segoe UI" w:cs="Segoe UI"/>
+      <w:sz w:val="16"/>
+      <w:szCs w:val="16"/>
+    </w:rPr>
+  </w:style>
+  <w:style w:type="character" w:customStyle="1" w:styleId="DocumentMapChar">
+    <w:name w:val="Document Map Char"/>
+    <w:basedOn w:val="DefaultParagraphFont"/>
+    <w:link w:val="DocumentMap"/>
+    <w:uiPriority w:val="99"/>
+    <w:semiHidden/>
+    <w:rsid w:val="001210B4"/>
+    <w:rPr>
+      <w:rFonts w:ascii="Segoe UI" w:eastAsia="Times New Roman" w:hAnsi="Segoe UI" w:cs="Segoe UI"/>
+      <w:sz w:val="16"/>
+      <w:szCs w:val="16"/>
+    </w:rPr>
+  </w:style>
+  <w:style w:type="paragraph" w:styleId="E-mailSignature">
+    <w:name w:val="E-mail Signature"/>
+    <w:basedOn w:val="Normal"/>
+    <w:link w:val="E-mailSignatureChar"/>
+    <w:uiPriority w:val="99"/>
+    <w:semiHidden/>
+    <w:unhideWhenUsed/>
+    <w:rsid w:val="001210B4"/>
+    <w:pPr>
+      <w:spacing w:after="0" w:line="240" w:lineRule="auto"/>
+    </w:pPr>
+  </w:style>
+  <w:style w:type="character" w:customStyle="1" w:styleId="E-mailSignatureChar">
+    <w:name w:val="E-mail Signature Char"/>
+    <w:basedOn w:val="DefaultParagraphFont"/>
+    <w:link w:val="E-mailSignature"/>
+    <w:uiPriority w:val="99"/>
+    <w:semiHidden/>
+    <w:rsid w:val="001210B4"/>
+    <w:rPr>
+      <w:rFonts w:ascii="Times New Roman" w:eastAsia="Times New Roman" w:hAnsi="Times New Roman"/>
+      <w:sz w:val="24"/>
+    </w:rPr>
+  </w:style>
+  <w:style w:type="paragraph" w:styleId="EndnoteText">
+    <w:name w:val="endnote text"/>
+    <w:basedOn w:val="Normal"/>
+    <w:link w:val="EndnoteTextChar"/>
+    <w:uiPriority w:val="99"/>
+    <w:semiHidden/>
+    <w:unhideWhenUsed/>
+    <w:rsid w:val="001210B4"/>
+    <w:pPr>
+      <w:spacing w:after="0" w:line="240" w:lineRule="auto"/>
+    </w:pPr>
+    <w:rPr>
+      <w:sz w:val="20"/>
+      <w:szCs w:val="20"/>
+    </w:rPr>
+  </w:style>
+  <w:style w:type="character" w:customStyle="1" w:styleId="EndnoteTextChar">
+    <w:name w:val="Endnote Text Char"/>
+    <w:basedOn w:val="DefaultParagraphFont"/>
+    <w:link w:val="EndnoteText"/>
+    <w:uiPriority w:val="99"/>
+    <w:semiHidden/>
+    <w:rsid w:val="001210B4"/>
+    <w:rPr>
+      <w:rFonts w:ascii="Times New Roman" w:eastAsia="Times New Roman" w:hAnsi="Times New Roman"/>
+      <w:sz w:val="20"/>
+      <w:szCs w:val="20"/>
+    </w:rPr>
+  </w:style>
+  <w:style w:type="paragraph" w:styleId="EnvelopeAddress">
+    <w:name w:val="envelope address"/>
+    <w:basedOn w:val="Normal"/>
+    <w:uiPriority w:val="99"/>
+    <w:semiHidden/>
+    <w:unhideWhenUsed/>
+    <w:rsid w:val="001210B4"/>
+    <w:pPr>
+      <w:framePr w:w="7920" w:h="1980" w:hRule="exact" w:hSpace="180" w:wrap="auto" w:hAnchor="page" w:xAlign="center" w:yAlign="bottom"/>
+      <w:spacing w:after="0" w:line="240" w:lineRule="auto"/>
+      <w:ind w:left="2880"/>
+    </w:pPr>
+    <w:rPr>
+      <w:rFonts w:asciiTheme="majorHAnsi" w:eastAsiaTheme="majorEastAsia" w:hAnsiTheme="majorHAnsi" w:cstheme="majorBidi"/>
+      <w:szCs w:val="24"/>
+    </w:rPr>
+  </w:style>
+  <w:style w:type="paragraph" w:styleId="EnvelopeReturn">
+    <w:name w:val="envelope return"/>
+    <w:basedOn w:val="Normal"/>
+    <w:uiPriority w:val="99"/>
+    <w:semiHidden/>
+    <w:unhideWhenUsed/>
+    <w:rsid w:val="001210B4"/>
+    <w:pPr>
+      <w:spacing w:after="0" w:line="240" w:lineRule="auto"/>
+    </w:pPr>
+    <w:rPr>
+      <w:rFonts w:asciiTheme="majorHAnsi" w:eastAsiaTheme="majorEastAsia" w:hAnsiTheme="majorHAnsi" w:cstheme="majorBidi"/>
+      <w:sz w:val="20"/>
+      <w:szCs w:val="20"/>
+    </w:rPr>
+  </w:style>
+  <w:style w:type="paragraph" w:styleId="FootnoteText">
+    <w:name w:val="footnote text"/>
+    <w:basedOn w:val="Normal"/>
+    <w:link w:val="FootnoteTextChar"/>
+    <w:uiPriority w:val="99"/>
+    <w:semiHidden/>
+    <w:unhideWhenUsed/>
+    <w:rsid w:val="001210B4"/>
+    <w:pPr>
+      <w:spacing w:after="0" w:line="240" w:lineRule="auto"/>
+    </w:pPr>
+    <w:rPr>
+      <w:sz w:val="20"/>
+      <w:szCs w:val="20"/>
+    </w:rPr>
+  </w:style>
+  <w:style w:type="character" w:customStyle="1" w:styleId="FootnoteTextChar">
+    <w:name w:val="Footnote Text Char"/>
+    <w:basedOn w:val="DefaultParagraphFont"/>
+    <w:link w:val="FootnoteText"/>
+    <w:uiPriority w:val="99"/>
+    <w:semiHidden/>
+    <w:rsid w:val="001210B4"/>
+    <w:rPr>
+      <w:rFonts w:ascii="Times New Roman" w:eastAsia="Times New Roman" w:hAnsi="Times New Roman"/>
+      <w:sz w:val="20"/>
+      <w:szCs w:val="20"/>
+    </w:rPr>
+  </w:style>
+  <w:style w:type="paragraph" w:styleId="HTMLAddress">
+    <w:name w:val="HTML Address"/>
+    <w:basedOn w:val="Normal"/>
+    <w:link w:val="HTMLAddressChar"/>
+    <w:uiPriority w:val="99"/>
+    <w:semiHidden/>
+    <w:unhideWhenUsed/>
+    <w:rsid w:val="001210B4"/>
+    <w:pPr>
+      <w:spacing w:after="0" w:line="240" w:lineRule="auto"/>
+    </w:pPr>
+    <w:rPr>
+      <w:i/>
+      <w:iCs/>
+    </w:rPr>
+  </w:style>
+  <w:style w:type="character" w:customStyle="1" w:styleId="HTMLAddressChar">
+    <w:name w:val="HTML Address Char"/>
+    <w:basedOn w:val="DefaultParagraphFont"/>
+    <w:link w:val="HTMLAddress"/>
+    <w:uiPriority w:val="99"/>
+    <w:semiHidden/>
+    <w:rsid w:val="001210B4"/>
+    <w:rPr>
+      <w:rFonts w:ascii="Times New Roman" w:eastAsia="Times New Roman" w:hAnsi="Times New Roman"/>
+      <w:i/>
+      <w:iCs/>
+      <w:sz w:val="24"/>
+    </w:rPr>
+  </w:style>
+  <w:style w:type="paragraph" w:styleId="HTMLPreformatted">
+    <w:name w:val="HTML Preformatted"/>
+    <w:basedOn w:val="Normal"/>
+    <w:link w:val="HTMLPreformattedChar"/>
+    <w:uiPriority w:val="99"/>
+    <w:semiHidden/>
+    <w:unhideWhenUsed/>
+    <w:rsid w:val="001210B4"/>
+    <w:pPr>
+      <w:spacing w:after="0" w:line="240" w:lineRule="auto"/>
+    </w:pPr>
+    <w:rPr>
+      <w:rFonts w:ascii="Consolas" w:hAnsi="Consolas"/>
+      <w:sz w:val="20"/>
+      <w:szCs w:val="20"/>
+    </w:rPr>
+  </w:style>
+  <w:style w:type="character" w:customStyle="1" w:styleId="HTMLPreformattedChar">
+    <w:name w:val="HTML Preformatted Char"/>
+    <w:basedOn w:val="DefaultParagraphFont"/>
+    <w:link w:val="HTMLPreformatted"/>
+    <w:uiPriority w:val="99"/>
+    <w:semiHidden/>
+    <w:rsid w:val="001210B4"/>
+    <w:rPr>
+      <w:rFonts w:ascii="Consolas" w:eastAsia="Times New Roman" w:hAnsi="Consolas"/>
+      <w:sz w:val="20"/>
+      <w:szCs w:val="20"/>
+    </w:rPr>
+  </w:style>
+  <w:style w:type="paragraph" w:styleId="Index1">
+    <w:name w:val="index 1"/>
+    <w:basedOn w:val="Normal"/>
+    <w:next w:val="Normal"/>
+    <w:autoRedefine/>
+    <w:uiPriority w:val="99"/>
+    <w:semiHidden/>
+    <w:unhideWhenUsed/>
+    <w:rsid w:val="001210B4"/>
+    <w:pPr>
+      <w:spacing w:after="0" w:line="240" w:lineRule="auto"/>
+      <w:ind w:left="240" w:hanging="240"/>
+    </w:pPr>
+  </w:style>
+  <w:style w:type="paragraph" w:styleId="Index2">
+    <w:name w:val="index 2"/>
+    <w:basedOn w:val="Normal"/>
+    <w:next w:val="Normal"/>
+    <w:autoRedefine/>
+    <w:uiPriority w:val="99"/>
+    <w:semiHidden/>
+    <w:unhideWhenUsed/>
+    <w:rsid w:val="001210B4"/>
+    <w:pPr>
+      <w:spacing w:after="0" w:line="240" w:lineRule="auto"/>
+      <w:ind w:left="480" w:hanging="240"/>
+    </w:pPr>
+  </w:style>
+  <w:style w:type="paragraph" w:styleId="Index3">
+    <w:name w:val="index 3"/>
+    <w:basedOn w:val="Normal"/>
+    <w:next w:val="Normal"/>
+    <w:autoRedefine/>
+    <w:uiPriority w:val="99"/>
+    <w:semiHidden/>
+    <w:unhideWhenUsed/>
+    <w:rsid w:val="001210B4"/>
+    <w:pPr>
+      <w:spacing w:after="0" w:line="240" w:lineRule="auto"/>
+      <w:ind w:left="720" w:hanging="240"/>
+    </w:pPr>
+  </w:style>
+  <w:style w:type="paragraph" w:styleId="Index4">
+    <w:name w:val="index 4"/>
+    <w:basedOn w:val="Normal"/>
+    <w:next w:val="Normal"/>
+    <w:autoRedefine/>
+    <w:uiPriority w:val="99"/>
+    <w:semiHidden/>
+    <w:unhideWhenUsed/>
+    <w:rsid w:val="001210B4"/>
+    <w:pPr>
+      <w:spacing w:after="0" w:line="240" w:lineRule="auto"/>
+      <w:ind w:left="960" w:hanging="240"/>
+    </w:pPr>
+  </w:style>
+  <w:style w:type="paragraph" w:styleId="Index5">
+    <w:name w:val="index 5"/>
+    <w:basedOn w:val="Normal"/>
+    <w:next w:val="Normal"/>
+    <w:autoRedefine/>
+    <w:uiPriority w:val="99"/>
+    <w:semiHidden/>
+    <w:unhideWhenUsed/>
+    <w:rsid w:val="001210B4"/>
+    <w:pPr>
+      <w:spacing w:after="0" w:line="240" w:lineRule="auto"/>
+      <w:ind w:left="1200" w:hanging="240"/>
+    </w:pPr>
+  </w:style>
+  <w:style w:type="paragraph" w:styleId="Index6">
+    <w:name w:val="index 6"/>
+    <w:basedOn w:val="Normal"/>
+    <w:next w:val="Normal"/>
+    <w:autoRedefine/>
+    <w:uiPriority w:val="99"/>
+    <w:semiHidden/>
+    <w:unhideWhenUsed/>
+    <w:rsid w:val="001210B4"/>
+    <w:pPr>
+      <w:spacing w:after="0" w:line="240" w:lineRule="auto"/>
+      <w:ind w:left="1440" w:hanging="240"/>
+    </w:pPr>
+  </w:style>
+  <w:style w:type="paragraph" w:styleId="Index7">
+    <w:name w:val="index 7"/>
+    <w:basedOn w:val="Normal"/>
+    <w:next w:val="Normal"/>
+    <w:autoRedefine/>
+    <w:uiPriority w:val="99"/>
+    <w:semiHidden/>
+    <w:unhideWhenUsed/>
+    <w:rsid w:val="001210B4"/>
+    <w:pPr>
+      <w:spacing w:after="0" w:line="240" w:lineRule="auto"/>
+      <w:ind w:left="1680" w:hanging="240"/>
+    </w:pPr>
+  </w:style>
+  <w:style w:type="paragraph" w:styleId="Index8">
+    <w:name w:val="index 8"/>
+    <w:basedOn w:val="Normal"/>
+    <w:next w:val="Normal"/>
+    <w:autoRedefine/>
+    <w:uiPriority w:val="99"/>
+    <w:semiHidden/>
+    <w:unhideWhenUsed/>
+    <w:rsid w:val="001210B4"/>
+    <w:pPr>
+      <w:spacing w:after="0" w:line="240" w:lineRule="auto"/>
+      <w:ind w:left="1920" w:hanging="240"/>
+    </w:pPr>
+  </w:style>
+  <w:style w:type="paragraph" w:styleId="Index9">
+    <w:name w:val="index 9"/>
+    <w:basedOn w:val="Normal"/>
+    <w:next w:val="Normal"/>
+    <w:autoRedefine/>
+    <w:uiPriority w:val="99"/>
+    <w:semiHidden/>
+    <w:unhideWhenUsed/>
+    <w:rsid w:val="001210B4"/>
+    <w:pPr>
+      <w:spacing w:after="0" w:line="240" w:lineRule="auto"/>
+      <w:ind w:left="2160" w:hanging="240"/>
+    </w:pPr>
+  </w:style>
+  <w:style w:type="paragraph" w:styleId="IndexHeading">
+    <w:name w:val="index heading"/>
+    <w:basedOn w:val="Normal"/>
+    <w:next w:val="Index1"/>
+    <w:uiPriority w:val="99"/>
+    <w:semiHidden/>
+    <w:unhideWhenUsed/>
+    <w:rsid w:val="001210B4"/>
+    <w:rPr>
+      <w:rFonts w:asciiTheme="majorHAnsi" w:eastAsiaTheme="majorEastAsia" w:hAnsiTheme="majorHAnsi" w:cstheme="majorBidi"/>
+      <w:b/>
+      <w:bCs/>
+    </w:rPr>
+  </w:style>
+  <w:style w:type="paragraph" w:styleId="List4">
+    <w:name w:val="List 4"/>
+    <w:basedOn w:val="Normal"/>
+    <w:uiPriority w:val="99"/>
+    <w:semiHidden/>
+    <w:unhideWhenUsed/>
+    <w:rsid w:val="001210B4"/>
+    <w:pPr>
+      <w:ind w:left="1440" w:hanging="360"/>
+      <w:contextualSpacing/>
+    </w:pPr>
+  </w:style>
+  <w:style w:type="paragraph" w:styleId="List5">
+    <w:name w:val="List 5"/>
+    <w:basedOn w:val="Normal"/>
+    <w:uiPriority w:val="99"/>
+    <w:semiHidden/>
+    <w:unhideWhenUsed/>
+    <w:rsid w:val="001210B4"/>
+    <w:pPr>
+      <w:ind w:left="1800" w:hanging="360"/>
+      <w:contextualSpacing/>
+    </w:pPr>
+  </w:style>
+  <w:style w:type="paragraph" w:styleId="ListBullet4">
+    <w:name w:val="List Bullet 4"/>
+    <w:basedOn w:val="Normal"/>
+    <w:uiPriority w:val="99"/>
+    <w:semiHidden/>
+    <w:unhideWhenUsed/>
+    <w:rsid w:val="001210B4"/>
+    <w:pPr>
+      <w:numPr>
+        <w:numId w:val="4"/>
+      </w:numPr>
+      <w:contextualSpacing/>
+    </w:pPr>
+  </w:style>
+  <w:style w:type="paragraph" w:styleId="ListBullet5">
+    <w:name w:val="List Bullet 5"/>
+    <w:basedOn w:val="Normal"/>
+    <w:uiPriority w:val="99"/>
+    <w:semiHidden/>
+    <w:unhideWhenUsed/>
+    <w:rsid w:val="001210B4"/>
+    <w:pPr>
+      <w:numPr>
+        <w:numId w:val="10"/>
+      </w:numPr>
+      <w:contextualSpacing/>
+    </w:pPr>
+  </w:style>
+  <w:style w:type="paragraph" w:styleId="ListContinue4">
+    <w:name w:val="List Continue 4"/>
+    <w:basedOn w:val="Normal"/>
+    <w:uiPriority w:val="99"/>
+    <w:semiHidden/>
+    <w:unhideWhenUsed/>
+    <w:rsid w:val="001210B4"/>
+    <w:pPr>
+      <w:spacing w:after="120"/>
+      <w:ind w:left="1440"/>
+      <w:contextualSpacing/>
+    </w:pPr>
+  </w:style>
+  <w:style w:type="paragraph" w:styleId="ListContinue5">
+    <w:name w:val="List Continue 5"/>
+    <w:basedOn w:val="Normal"/>
+    <w:uiPriority w:val="99"/>
+    <w:semiHidden/>
+    <w:unhideWhenUsed/>
+    <w:rsid w:val="001210B4"/>
+    <w:pPr>
+      <w:spacing w:after="120"/>
+      <w:ind w:left="1800"/>
+      <w:contextualSpacing/>
+    </w:pPr>
+  </w:style>
+  <w:style w:type="paragraph" w:styleId="ListNumber4">
+    <w:name w:val="List Number 4"/>
+    <w:basedOn w:val="Normal"/>
+    <w:uiPriority w:val="99"/>
+    <w:semiHidden/>
+    <w:unhideWhenUsed/>
+    <w:rsid w:val="001210B4"/>
+    <w:pPr>
+      <w:numPr>
+        <w:numId w:val="11"/>
+      </w:numPr>
+      <w:contextualSpacing/>
+    </w:pPr>
+  </w:style>
+  <w:style w:type="paragraph" w:styleId="ListNumber5">
+    <w:name w:val="List Number 5"/>
+    <w:basedOn w:val="Normal"/>
+    <w:uiPriority w:val="99"/>
+    <w:semiHidden/>
+    <w:unhideWhenUsed/>
+    <w:rsid w:val="001210B4"/>
+    <w:pPr>
+      <w:numPr>
+        <w:numId w:val="12"/>
+      </w:numPr>
+      <w:contextualSpacing/>
+    </w:pPr>
+  </w:style>
+  <w:style w:type="paragraph" w:styleId="MessageHeader">
+    <w:name w:val="Message Header"/>
+    <w:basedOn w:val="Normal"/>
+    <w:link w:val="MessageHeaderChar"/>
+    <w:uiPriority w:val="99"/>
+    <w:semiHidden/>
+    <w:unhideWhenUsed/>
+    <w:rsid w:val="001210B4"/>
+    <w:pPr>
+      <w:pBdr>
+        <w:top w:val="single" w:sz="6" w:space="1" w:color="auto"/>
+        <w:left w:val="single" w:sz="6" w:space="1" w:color="auto"/>
+        <w:bottom w:val="single" w:sz="6" w:space="1" w:color="auto"/>
+        <w:right w:val="single" w:sz="6" w:space="1" w:color="auto"/>
+      </w:pBdr>
+      <w:shd w:val="pct20" w:color="auto" w:fill="auto"/>
+      <w:spacing w:after="0" w:line="240" w:lineRule="auto"/>
+      <w:ind w:left="1080" w:hanging="1080"/>
+    </w:pPr>
+    <w:rPr>
+      <w:rFonts w:asciiTheme="majorHAnsi" w:eastAsiaTheme="majorEastAsia" w:hAnsiTheme="majorHAnsi" w:cstheme="majorBidi"/>
+      <w:szCs w:val="24"/>
+    </w:rPr>
+  </w:style>
+  <w:style w:type="character" w:customStyle="1" w:styleId="MessageHeaderChar">
+    <w:name w:val="Message Header Char"/>
+    <w:basedOn w:val="DefaultParagraphFont"/>
+    <w:link w:val="MessageHeader"/>
+    <w:uiPriority w:val="99"/>
+    <w:semiHidden/>
+    <w:rsid w:val="001210B4"/>
+    <w:rPr>
+      <w:rFonts w:asciiTheme="majorHAnsi" w:eastAsiaTheme="majorEastAsia" w:hAnsiTheme="majorHAnsi" w:cstheme="majorBidi"/>
+      <w:sz w:val="24"/>
+      <w:szCs w:val="24"/>
+      <w:shd w:val="pct20" w:color="auto" w:fill="auto"/>
+    </w:rPr>
+  </w:style>
+  <w:style w:type="paragraph" w:styleId="NormalWeb">
+    <w:name w:val="Normal (Web)"/>
+    <w:basedOn w:val="Normal"/>
+    <w:uiPriority w:val="99"/>
+    <w:semiHidden/>
+    <w:unhideWhenUsed/>
+    <w:rsid w:val="001210B4"/>
+    <w:rPr>
+      <w:rFonts w:cs="Times New Roman"/>
+      <w:szCs w:val="24"/>
+    </w:rPr>
+  </w:style>
+  <w:style w:type="paragraph" w:styleId="NormalIndent">
+    <w:name w:val="Normal Indent"/>
+    <w:basedOn w:val="Normal"/>
+    <w:uiPriority w:val="99"/>
+    <w:semiHidden/>
+    <w:unhideWhenUsed/>
+    <w:rsid w:val="001210B4"/>
+    <w:pPr>
+      <w:ind w:left="720"/>
+    </w:pPr>
+  </w:style>
+  <w:style w:type="paragraph" w:styleId="NoteHeading">
+    <w:name w:val="Note Heading"/>
+    <w:basedOn w:val="Normal"/>
+    <w:next w:val="Normal"/>
+    <w:link w:val="NoteHeadingChar"/>
+    <w:uiPriority w:val="99"/>
+    <w:semiHidden/>
+    <w:unhideWhenUsed/>
+    <w:rsid w:val="001210B4"/>
+    <w:pPr>
+      <w:spacing w:after="0" w:line="240" w:lineRule="auto"/>
+    </w:pPr>
+  </w:style>
+  <w:style w:type="character" w:customStyle="1" w:styleId="NoteHeadingChar">
+    <w:name w:val="Note Heading Char"/>
+    <w:basedOn w:val="DefaultParagraphFont"/>
+    <w:link w:val="NoteHeading"/>
+    <w:uiPriority w:val="99"/>
+    <w:semiHidden/>
+    <w:rsid w:val="001210B4"/>
+    <w:rPr>
+      <w:rFonts w:ascii="Times New Roman" w:eastAsia="Times New Roman" w:hAnsi="Times New Roman"/>
+      <w:sz w:val="24"/>
+    </w:rPr>
+  </w:style>
+  <w:style w:type="paragraph" w:styleId="PlainText">
+    <w:name w:val="Plain Text"/>
+    <w:basedOn w:val="Normal"/>
+    <w:link w:val="PlainTextChar"/>
+    <w:uiPriority w:val="99"/>
+    <w:semiHidden/>
+    <w:unhideWhenUsed/>
+    <w:rsid w:val="001210B4"/>
+    <w:pPr>
+      <w:spacing w:after="0" w:line="240" w:lineRule="auto"/>
+    </w:pPr>
+    <w:rPr>
+      <w:rFonts w:ascii="Consolas" w:hAnsi="Consolas"/>
+      <w:sz w:val="21"/>
+      <w:szCs w:val="21"/>
+    </w:rPr>
+  </w:style>
+  <w:style w:type="character" w:customStyle="1" w:styleId="PlainTextChar">
+    <w:name w:val="Plain Text Char"/>
+    <w:basedOn w:val="DefaultParagraphFont"/>
+    <w:link w:val="PlainText"/>
+    <w:uiPriority w:val="99"/>
+    <w:semiHidden/>
+    <w:rsid w:val="001210B4"/>
+    <w:rPr>
+      <w:rFonts w:ascii="Consolas" w:eastAsia="Times New Roman" w:hAnsi="Consolas"/>
+      <w:sz w:val="21"/>
+      <w:szCs w:val="21"/>
+    </w:rPr>
+  </w:style>
+  <w:style w:type="paragraph" w:styleId="Salutation">
+    <w:name w:val="Salutation"/>
+    <w:basedOn w:val="Normal"/>
+    <w:next w:val="Normal"/>
+    <w:link w:val="SalutationChar"/>
+    <w:uiPriority w:val="99"/>
+    <w:semiHidden/>
+    <w:unhideWhenUsed/>
+    <w:rsid w:val="001210B4"/>
+  </w:style>
+  <w:style w:type="character" w:customStyle="1" w:styleId="SalutationChar">
+    <w:name w:val="Salutation Char"/>
+    <w:basedOn w:val="DefaultParagraphFont"/>
+    <w:link w:val="Salutation"/>
+    <w:uiPriority w:val="99"/>
+    <w:semiHidden/>
+    <w:rsid w:val="001210B4"/>
+    <w:rPr>
+      <w:rFonts w:ascii="Times New Roman" w:eastAsia="Times New Roman" w:hAnsi="Times New Roman"/>
+      <w:sz w:val="24"/>
+    </w:rPr>
+  </w:style>
+  <w:style w:type="paragraph" w:styleId="Signature">
+    <w:name w:val="Signature"/>
+    <w:basedOn w:val="Normal"/>
+    <w:link w:val="SignatureChar"/>
+    <w:uiPriority w:val="99"/>
+    <w:semiHidden/>
+    <w:unhideWhenUsed/>
+    <w:rsid w:val="001210B4"/>
+    <w:pPr>
+      <w:spacing w:after="0" w:line="240" w:lineRule="auto"/>
+      <w:ind w:left="4320"/>
+    </w:pPr>
+  </w:style>
+  <w:style w:type="character" w:customStyle="1" w:styleId="SignatureChar">
+    <w:name w:val="Signature Char"/>
+    <w:basedOn w:val="DefaultParagraphFont"/>
+    <w:link w:val="Signature"/>
+    <w:uiPriority w:val="99"/>
+    <w:semiHidden/>
+    <w:rsid w:val="001210B4"/>
+    <w:rPr>
+      <w:rFonts w:ascii="Times New Roman" w:eastAsia="Times New Roman" w:hAnsi="Times New Roman"/>
+      <w:sz w:val="24"/>
+    </w:rPr>
+  </w:style>
+  <w:style w:type="paragraph" w:styleId="TableofAuthorities">
+    <w:name w:val="table of authorities"/>
+    <w:basedOn w:val="Normal"/>
+    <w:next w:val="Normal"/>
+    <w:uiPriority w:val="99"/>
+    <w:semiHidden/>
+    <w:unhideWhenUsed/>
+    <w:rsid w:val="001210B4"/>
+    <w:pPr>
+      <w:spacing w:after="0"/>
+      <w:ind w:left="240" w:hanging="240"/>
+    </w:pPr>
+  </w:style>
+  <w:style w:type="paragraph" w:styleId="TableofFigures">
+    <w:name w:val="table of figures"/>
+    <w:basedOn w:val="Normal"/>
+    <w:next w:val="Normal"/>
+    <w:uiPriority w:val="99"/>
+    <w:semiHidden/>
+    <w:unhideWhenUsed/>
+    <w:rsid w:val="001210B4"/>
+    <w:pPr>
+      <w:spacing w:after="0"/>
+    </w:pPr>
+  </w:style>
+  <w:style w:type="paragraph" w:styleId="TOAHeading">
+    <w:name w:val="toa heading"/>
+    <w:basedOn w:val="Normal"/>
+    <w:next w:val="Normal"/>
+    <w:uiPriority w:val="99"/>
+    <w:semiHidden/>
+    <w:unhideWhenUsed/>
+    <w:rsid w:val="001210B4"/>
+    <w:pPr>
+      <w:spacing w:before="120"/>
+    </w:pPr>
+    <w:rPr>
+      <w:rFonts w:asciiTheme="majorHAnsi" w:eastAsiaTheme="majorEastAsia" w:hAnsiTheme="majorHAnsi" w:cstheme="majorBidi"/>
+      <w:b/>
+      <w:bCs/>
+      <w:szCs w:val="24"/>
+    </w:rPr>
+  </w:style>
+  <w:style w:type="paragraph" w:styleId="TOC1">
+    <w:name w:val="toc 1"/>
+    <w:basedOn w:val="Normal"/>
+    <w:next w:val="Normal"/>
+    <w:autoRedefine/>
+    <w:uiPriority w:val="39"/>
+    <w:semiHidden/>
+    <w:unhideWhenUsed/>
+    <w:rsid w:val="001210B4"/>
+    <w:pPr>
+      <w:spacing w:after="100"/>
+    </w:pPr>
+  </w:style>
+  <w:style w:type="paragraph" w:styleId="TOC2">
+    <w:name w:val="toc 2"/>
+    <w:basedOn w:val="Normal"/>
+    <w:next w:val="Normal"/>
+    <w:autoRedefine/>
+    <w:uiPriority w:val="39"/>
+    <w:semiHidden/>
+    <w:unhideWhenUsed/>
+    <w:rsid w:val="001210B4"/>
+    <w:pPr>
+      <w:spacing w:after="100"/>
+      <w:ind w:left="240"/>
+    </w:pPr>
+  </w:style>
+  <w:style w:type="paragraph" w:styleId="TOC3">
+    <w:name w:val="toc 3"/>
+    <w:basedOn w:val="Normal"/>
+    <w:next w:val="Normal"/>
+    <w:autoRedefine/>
+    <w:uiPriority w:val="39"/>
+    <w:semiHidden/>
+    <w:unhideWhenUsed/>
+    <w:rsid w:val="001210B4"/>
+    <w:pPr>
+      <w:spacing w:after="100"/>
+      <w:ind w:left="480"/>
+    </w:pPr>
+  </w:style>
+  <w:style w:type="paragraph" w:styleId="TOC4">
+    <w:name w:val="toc 4"/>
+    <w:basedOn w:val="Normal"/>
+    <w:next w:val="Normal"/>
+    <w:autoRedefine/>
+    <w:uiPriority w:val="39"/>
+    <w:semiHidden/>
+    <w:unhideWhenUsed/>
+    <w:rsid w:val="001210B4"/>
+    <w:pPr>
+      <w:spacing w:after="100"/>
+      <w:ind w:left="720"/>
+    </w:pPr>
+  </w:style>
+  <w:style w:type="paragraph" w:styleId="TOC5">
+    <w:name w:val="toc 5"/>
+    <w:basedOn w:val="Normal"/>
+    <w:next w:val="Normal"/>
+    <w:autoRedefine/>
+    <w:uiPriority w:val="39"/>
+    <w:semiHidden/>
+    <w:unhideWhenUsed/>
+    <w:rsid w:val="001210B4"/>
+    <w:pPr>
+      <w:spacing w:after="100"/>
+      <w:ind w:left="960"/>
+    </w:pPr>
+  </w:style>
+  <w:style w:type="paragraph" w:styleId="TOC6">
+    <w:name w:val="toc 6"/>
+    <w:basedOn w:val="Normal"/>
+    <w:next w:val="Normal"/>
+    <w:autoRedefine/>
+    <w:uiPriority w:val="39"/>
+    <w:semiHidden/>
+    <w:unhideWhenUsed/>
+    <w:rsid w:val="001210B4"/>
+    <w:pPr>
+      <w:spacing w:after="100"/>
+      <w:ind w:left="1200"/>
+    </w:pPr>
+  </w:style>
+  <w:style w:type="paragraph" w:styleId="TOC7">
+    <w:name w:val="toc 7"/>
+    <w:basedOn w:val="Normal"/>
+    <w:next w:val="Normal"/>
+    <w:autoRedefine/>
+    <w:uiPriority w:val="39"/>
+    <w:semiHidden/>
+    <w:unhideWhenUsed/>
+    <w:rsid w:val="001210B4"/>
+    <w:pPr>
+      <w:spacing w:after="100"/>
+      <w:ind w:left="1440"/>
+    </w:pPr>
+  </w:style>
+  <w:style w:type="paragraph" w:styleId="TOC8">
+    <w:name w:val="toc 8"/>
+    <w:basedOn w:val="Normal"/>
+    <w:next w:val="Normal"/>
+    <w:autoRedefine/>
+    <w:uiPriority w:val="39"/>
+    <w:semiHidden/>
+    <w:unhideWhenUsed/>
+    <w:rsid w:val="001210B4"/>
+    <w:pPr>
+      <w:spacing w:after="100"/>
+      <w:ind w:left="1680"/>
+    </w:pPr>
+  </w:style>
+  <w:style w:type="paragraph" w:styleId="TOC9">
+    <w:name w:val="toc 9"/>
+    <w:basedOn w:val="Normal"/>
+    <w:next w:val="Normal"/>
+    <w:autoRedefine/>
+    <w:uiPriority w:val="39"/>
+    <w:semiHidden/>
+    <w:unhideWhenUsed/>
+    <w:rsid w:val="001210B4"/>
+    <w:pPr>
+      <w:spacing w:after="100"/>
+      <w:ind w:left="1920"/>
+    </w:pPr>
+  </w:style>
 </w:styles>
 </file>
 

</xml_diff>